<commit_message>
Correct FTE grant cap and deadline from live dcarts.dc.gov page
The earlier $50,000 cap was pulled from a PDF snippet that turned out
to be wrong. Dumisani checked the live FY27 FTE program page directly:
the actual maximum organization award is up to $30,000, and the
deadline is confirmed as 5:00 PM ET, Thursday, July 24, 2026. Our
$5,500 ask still has significant headroom under the corrected cap.
</commit_message>
<xml_diff>
--- a/app/drafts/exports/DC Arts and Humanities FTE Grant Draft.docx
+++ b/app/drafts/exports/DC Arts and Humanities FTE Grant Draft.docx
@@ -201,7 +201,7 @@
               <w:rPr>
                 <w:sz w:val="20"/>
               </w:rPr>
-              <w:t>$50,000, no match required — per CAH FY 2027 Guide to Grants (dcarts.dc.gov, published April 21, 2026). Our ask is well under the cap; the cap was never the constraint, the original $4,500 figure was just built on a wrong ticket-price assumption.</w:t>
+              <w:t>Up to $30,000 — per the live FY27 FTE program page (dcarts.dc.gov/grants/field-trip-experiences), verified directly by Dumisani on July 14, 2026. CORRECTION: an earlier pass in this draft cited $50,000 from a PDF ("CAH FY 2027 Guide to Grants") snippet — that figure was wrong; the live program page is the authoritative source and shows $30,000. Our ask is still well under the cap.</w:t>
             </w:r>
           </w:p>
         </w:tc>
@@ -239,7 +239,7 @@
               <w:rPr>
                 <w:sz w:val="20"/>
               </w:rPr>
-              <w:t>Friday, July 24, 2026 (per internal grant tracker) — one search result showed July 27, 2026, 5:00 pm EST instead; confirm the exact date and time directly on dcarts.dc.gov before submission</w:t>
+              <w:t>5:00 PM ET, Thursday, July 24, 2026 — confirmed directly from the live FY27 FTE program page (dcarts.dc.gov/grants/field-trip-experiences). Program released Tuesday, June 23, 2026. This resolves the earlier July 24 vs. July 27 discrepancy in Neo's favor of July 24.</w:t>
             </w:r>
           </w:p>
         </w:tc>
@@ -2105,7 +2105,7 @@
     <w:p/>
     <w:p>
       <w:r>
-        <w:t>CORRECTED: the ticket line previously assumed the $4/ticket D.C. Ticket Partnership rate. That program is confirmed restricted to D.C. public/charter schools applying directly, is not open to nonprofit afterschool programs, and its FY27 application window is not yet open. The $30/ticket figure above is a mid-range estimate (list price $49, with Arena Stage advertising group discounts of up to 40-50%) — get a formal written quote from Arena Stage Group Sales (202-488-4380 / groups@arenastage.org) before finalizing this figure. Confirmed cap: CAH's FY 2027 Guide to Grants lists the FTE maximum award as $50,000, no match required — this $5,500 ask has significant headroom under that cap and is not constrained by it.</w:t>
+        <w:t>CORRECTED: the ticket line previously assumed the $4/ticket D.C. Ticket Partnership rate. That program is confirmed restricted to D.C. public/charter schools applying directly, is not open to nonprofit afterschool programs, and its FY27 application window is not yet open. The $30/ticket figure above is a mid-range estimate (list price $49, with Arena Stage advertising group discounts of up to 40-50%) — get a formal written quote from Arena Stage Group Sales (202-488-4380 / groups@arenastage.org) before finalizing this figure. Confirmed cap: the live FY27 FTE program page (dcarts.dc.gov/grants/field-trip-experiences) lists the maximum organization award as up to $30,000 — this $5,500 ask has significant headroom under that cap and is not constrained by it.</w:t>
       </w:r>
     </w:p>
     <w:p>
@@ -2193,7 +2193,7 @@
         <w:pStyle w:val="ListBullet"/>
       </w:pPr>
       <w:r>
-        <w:t>02 [x] Funder ask is within the stated cap — CAH FY 2027 Guide to Grants confirms $50,000 maximum award, no match required; our $5,500 ask has significant headroom</w:t>
+        <w:t>02 [x] Funder ask is within the stated cap — live FY27 FTE program page confirms up to $30,000 maximum organization award; our $5,500 ask has significant headroom</w:t>
       </w:r>
     </w:p>
     <w:p>
@@ -2281,7 +2281,7 @@
         <w:pStyle w:val="ListBullet"/>
       </w:pPr>
       <w:r>
-        <w:t>10 [ ] Exact deadline date needs confirming (July 24 vs. July 27 discrepancy between sources)</w:t>
+        <w:t>10 [x] Deadline confirmed: 5:00 PM ET, Thursday, July 24, 2026 (live FY27 FTE program page)</w:t>
       </w:r>
     </w:p>
     <w:p>
@@ -2575,15 +2575,25 @@
         <w:rPr>
           <w:b/>
         </w:rPr>
-        <w:t>Confirmed funder cap: $50,000, no match required</w:t>
+        <w:t>Confirmed funder cap: up to $30,000</w:t>
       </w:r>
       <w:r>
-        <w:t xml:space="preserve"> (CAH FY 2027 Guide to Grants,</w:t>
+        <w:t xml:space="preserve"> (live FY27 FTE program page,</w:t>
       </w:r>
     </w:p>
     <w:p>
       <w:r>
-        <w:t>dcarts.dc.gov, published April 2026). We are nowhere near the cap; it was never the constraint.</w:t>
+        <w:t>dcarts.dc.gov/grants/field-trip-experiences, verified July 14, 2026). We are nowhere near the</w:t>
+      </w:r>
+    </w:p>
+    <w:p>
+      <w:r>
+        <w:t>cap; it was never the constraint. Deadline confirmed from the same page: 5:00 PM ET, Thursday,</w:t>
+      </w:r>
+    </w:p>
+    <w:p>
+      <w:r>
+        <w:t>July 24, 2026.</w:t>
       </w:r>
     </w:p>
     <w:tbl>
@@ -2992,7 +3002,7 @@
         <w:pStyle w:val="ListBullet"/>
       </w:pPr>
       <w:r>
-        <w:t>$50,000 funder cap, no match required</w:t>
+        <w:t>Up to $30,000 funder cap and July 24, 2026 5PM ET deadline, confirmed from the live program page</w:t>
       </w:r>
     </w:p>
     <w:p>

</xml_diff>

<commit_message>
Reconcile draft against the actual FY27 FTE RFA text
Dumisani pasted the full RFA. Key corrections: grade grouping is a
hard single-band requirement tied to discipline (Theatre only allowed
for 6-12, so this trip should be classified as Dance instead, since
Step Afrika is a dance company); submission is via the Submittable
portal specifically; the Program Officer (Andrea Brown) is now
confirmed by name; the Clean Hands certificate on file is stale
against the RFA's 30-day rule; Business License gaps may be a
baseline eligibility issue via DLCP registration, not just a missing
attachment; and the attachments checklist expands from 7 to 14 items
plus a required financial misconduct disclosure. Added a technical
assistance deadline flag (July 17) given the volume of open items.
</commit_message>
<xml_diff>
--- a/app/drafts/exports/DC Arts and Humanities FTE Grant Draft.docx
+++ b/app/drafts/exports/DC Arts and Humanities FTE Grant Draft.docx
@@ -277,7 +277,7 @@
               <w:rPr>
                 <w:sz w:val="20"/>
               </w:rPr>
-              <w:t>Not independently verified — dcarts.dc.gov is not reachable from this environment</w:t>
+              <w:t>Online ONLY via the CAH Grants Application Portal / Submittable: https://dccommissionontheartshumanities.submittable.com/submit. No mailed, emailed, or hand-delivered applications accepted. Confirmed directly from the full FY27 FTE RFA text (pasted in by Dumisani, July 14, 2026).</w:t>
             </w:r>
           </w:p>
         </w:tc>
@@ -315,7 +315,7 @@
               <w:rPr>
                 <w:sz w:val="20"/>
               </w:rPr>
-              <w:t>Not listed in the dev bible entry — needs sourcing before submission</w:t>
+              <w:t>Andrea Brown, Arts Learning Coordinator — andrea.brown3@dc.gov, (202) 671-2304. Commission on the Arts and Humanities, 200 I Street SE, Suite 1400, Washington, DC 20003. Confirmed directly from the RFA's Section VII (CAH Contact) — this name is safe to use, unlike the unverified names an AI search tool surfaced earlier in this process.</w:t>
             </w:r>
           </w:p>
         </w:tc>
@@ -368,6 +368,149 @@
     <w:p>
       <w:r>
         <w:t>CORRECTED: the $4/ticket rate originally assumed here was Arena Stage's D.C. Ticket Partnership rate. That program is confirmed restricted to D.C. public/charter schools applying directly — it is not open to nonprofit afterschool programs like GOODLearningHub, and the FY27 application cycle is not yet open (last cycle's deadline was Sept 24, 2025, after this grant's deadline anyway). The budget below now uses Arena Stage's standard Group Sales rate instead. Title I status of partner schools is no longer relevant to this budget for that reason.</w:t>
+      </w:r>
+    </w:p>
+    <w:p>
+      <w:pPr>
+        <w:pStyle w:val="Heading2"/>
+      </w:pPr>
+      <w:r>
+        <w:t>ELIGIBILITY CHECK (against FY27 FTE RFA Section III)</w:t>
+      </w:r>
+    </w:p>
+    <w:p>
+      <w:r>
+        <w:t>The RFA lists 8 minimum eligibility requirements, all of which must be met at submission:</w:t>
+      </w:r>
+    </w:p>
+    <w:p>
+      <w:pPr>
+        <w:pStyle w:val="ListNumber"/>
+      </w:pPr>
+      <w:r>
+        <w:t>501(c)(3) status, IRS letter dated at least 1 year before deadline — [x] on file, GOODProjects has held this well over a year</w:t>
+      </w:r>
+    </w:p>
+    <w:p>
+      <w:pPr>
+        <w:pStyle w:val="ListNumber"/>
+      </w:pPr>
+      <w:r>
+        <w:t>Registered/authorized to do business in DC — [ ] needs confirming this is current</w:t>
+      </w:r>
+    </w:p>
+    <w:p>
+      <w:pPr>
+        <w:pStyle w:val="ListNumber"/>
+      </w:pPr>
+      <w:r>
+        <w:t>Planning and implementation fully carried out in DC — [x] Arena Stage is in Southwest DC</w:t>
+      </w:r>
+    </w:p>
+    <w:p>
+      <w:pPr>
+        <w:pStyle w:val="ListNumber"/>
+      </w:pPr>
+      <w:r>
+        <w:t>Active Board of Directors — [x] available</w:t>
+      </w:r>
+    </w:p>
+    <w:p>
+      <w:pPr>
+        <w:pStyle w:val="ListNumber"/>
+      </w:pPr>
+      <w:r>
+        <w:t xml:space="preserve">Registered with DLCP, OCFO, DOES, and IRS — [ ] </w:t>
+      </w:r>
+      <w:r>
+        <w:rPr>
+          <w:b/>
+        </w:rPr>
+        <w:t>FLAG: this is likely tied to the missing Business License.</w:t>
+      </w:r>
+      <w:r>
+        <w:t xml:space="preserve"> The Business License gap noted in the attachments checklist may not just be a missing document — DLCP registration is a baseline eligibility requirement here. Confirm GOODProjects' DLCP/business license status before treating this as a simple paperwork gap; if it's genuinely missing, that's a bigger problem than an attachment checkbox.</w:t>
+      </w:r>
+    </w:p>
+    <w:p>
+      <w:pPr>
+        <w:pStyle w:val="ListNumber"/>
+      </w:pPr>
+      <w:r>
+        <w:t>Current on DC taxes/liabilities, or Clean Hands certified — [ ] on file but likely stale, see attachments checklist</w:t>
+      </w:r>
+    </w:p>
+    <w:p>
+      <w:pPr>
+        <w:pStyle w:val="ListNumber"/>
+      </w:pPr>
+      <w:r>
+        <w:t>Good standing with CAH — [x] no known issues</w:t>
+      </w:r>
+    </w:p>
+    <w:p>
+      <w:pPr>
+        <w:pStyle w:val="ListNumber"/>
+      </w:pPr>
+      <w:r>
+        <w:t>Principal business office address in DC, not a PO box — [x] 996 Maine Avenue SW, Suite 208, confirmed physical DC address</w:t>
+      </w:r>
+    </w:p>
+    <w:p>
+      <w:r>
+        <w:t>OTHER ELIGIBILITY NOTES:</w:t>
+      </w:r>
+    </w:p>
+    <w:p>
+      <w:pPr>
+        <w:pStyle w:val="ListBullet"/>
+      </w:pPr>
+      <w:r>
+        <w:rPr>
+          <w:b/>
+        </w:rPr>
+        <w:t>GOS overlap rule:</w:t>
+      </w:r>
+      <w:r>
+        <w:t xml:space="preserve"> if GOODProjects has applied for or plans to accept a CAH FY27 General Operating Support (GOS) award, this FTE application is only allowed if it represents genuinely new/additional programming beyond the GOS scope. NEED TO CONFIRM: has GOODProjects applied for FY27 GOS this cycle? If yes, Neo needs to confirm this field trip isn't already covered there.</w:t>
+      </w:r>
+    </w:p>
+    <w:p>
+      <w:pPr>
+        <w:pStyle w:val="ListBullet"/>
+      </w:pPr>
+      <w:r>
+        <w:t>One FTE application per fiscal year — fine, this is our only one.</w:t>
+      </w:r>
+    </w:p>
+    <w:p>
+      <w:pPr>
+        <w:pStyle w:val="ListBullet"/>
+      </w:pPr>
+      <w:r>
+        <w:t>No match/cost-share required — confirmed, matches our budget.</w:t>
+      </w:r>
+    </w:p>
+    <w:p>
+      <w:pPr>
+        <w:pStyle w:val="ListBullet"/>
+      </w:pPr>
+      <w:r>
+        <w:t>Not ineligible on any of the RFA's exclusion grounds (not a service org, not majority non-DC constituents, not requiring a fiscal agent, not for-profit, etc.) — GOODProjects appears to clear all of these.</w:t>
+      </w:r>
+    </w:p>
+    <w:p>
+      <w:r>
+        <w:t xml:space="preserve">TECHNICAL ASSISTANCE STILL AVAILABLE: CAH offers 30-minute application review appointments, but they must be scheduled at least 7 calendar days before the deadline — meaning the cutoff to request one is </w:t>
+      </w:r>
+      <w:r>
+        <w:rPr>
+          <w:b/>
+        </w:rPr>
+        <w:t>Friday, July 17, 2026</w:t>
+      </w:r>
+      <w:r>
+        <w:t>. Given the number of open items above, worth considering booking a slot before that cutoff, contacting Andrea Brown (andrea.brown3@dc.gov, 202-671-2304).</w:t>
       </w:r>
     </w:p>
     <w:p>
@@ -623,7 +766,233 @@
     <w:p/>
     <w:p>
       <w:r>
-        <w:t>OPEN DECISION FOR NEO: prior-year FTE guidance required applicants to target one single grade grouping aligned with DCPS's arts curricular framework, not a broad span. Our 5-14 age range likely spans multiple groupings (roughly PreK-2, 3-5, 6-8). Before submitting, confirm whether this rule carried into the FY27 RFA and, if so, decide whether to narrow the cohort to one grade band or confirm with CAH that a mixed afterschool cohort is acceptable.</w:t>
+        <w:t>RESOLVED (from the actual FY27 RFA text, Section I): organizations MUST target exactly ONE grade grouping, each tied to a specific discipline:</w:t>
+      </w:r>
+    </w:p>
+    <w:tbl>
+      <w:tblPr>
+        <w:tblStyle w:val="LightGrid-Accent1"/>
+        <w:tblW w:type="auto" w:w="0"/>
+        <w:tblLook w:firstColumn="1" w:firstRow="1" w:lastColumn="0" w:lastRow="0" w:noHBand="0" w:noVBand="1" w:val="04A0"/>
+      </w:tblPr>
+      <w:tblGrid>
+        <w:gridCol w:w="4320"/>
+        <w:gridCol w:w="4320"/>
+      </w:tblGrid>
+      <w:tr>
+        <w:tc>
+          <w:tcPr>
+            <w:tcW w:type="dxa" w:w="4320"/>
+            <w:shd w:fill="1F4E5F"/>
+          </w:tcPr>
+          <w:p>
+            <w:r>
+              <w:rPr>
+                <w:b/>
+                <w:color w:val="FFFFFF"/>
+                <w:sz w:val="20"/>
+              </w:rPr>
+            </w:r>
+            <w:r>
+              <w:rPr>
+                <w:b/>
+                <w:color w:val="FFFFFF"/>
+                <w:sz w:val="20"/>
+              </w:rPr>
+              <w:t>Grade Grouping</w:t>
+            </w:r>
+          </w:p>
+        </w:tc>
+        <w:tc>
+          <w:tcPr>
+            <w:tcW w:type="dxa" w:w="4320"/>
+            <w:shd w:fill="1F4E5F"/>
+          </w:tcPr>
+          <w:p>
+            <w:r>
+              <w:rPr>
+                <w:b/>
+                <w:color w:val="FFFFFF"/>
+                <w:sz w:val="20"/>
+              </w:rPr>
+            </w:r>
+            <w:r>
+              <w:rPr>
+                <w:b/>
+                <w:color w:val="FFFFFF"/>
+                <w:sz w:val="20"/>
+              </w:rPr>
+              <w:t>Allowed Discipline Focus</w:t>
+            </w:r>
+          </w:p>
+        </w:tc>
+      </w:tr>
+      <w:tr>
+        <w:tc>
+          <w:tcPr>
+            <w:tcW w:type="dxa" w:w="4320"/>
+          </w:tcPr>
+          <w:p>
+            <w:r>
+              <w:rPr>
+                <w:sz w:val="20"/>
+              </w:rPr>
+            </w:r>
+            <w:r>
+              <w:rPr>
+                <w:sz w:val="20"/>
+              </w:rPr>
+              <w:t>Kindergarten – 2nd Grade</w:t>
+            </w:r>
+          </w:p>
+        </w:tc>
+        <w:tc>
+          <w:tcPr>
+            <w:tcW w:type="dxa" w:w="4320"/>
+          </w:tcPr>
+          <w:p>
+            <w:r>
+              <w:rPr>
+                <w:sz w:val="20"/>
+              </w:rPr>
+            </w:r>
+            <w:r>
+              <w:rPr>
+                <w:sz w:val="20"/>
+              </w:rPr>
+              <w:t>Dance, Music, or Visual Arts</w:t>
+            </w:r>
+          </w:p>
+        </w:tc>
+      </w:tr>
+      <w:tr>
+        <w:tc>
+          <w:tcPr>
+            <w:tcW w:type="dxa" w:w="4320"/>
+          </w:tcPr>
+          <w:p>
+            <w:r>
+              <w:rPr>
+                <w:sz w:val="20"/>
+              </w:rPr>
+            </w:r>
+            <w:r>
+              <w:rPr>
+                <w:sz w:val="20"/>
+              </w:rPr>
+              <w:t>3rd – 5th Grade</w:t>
+            </w:r>
+          </w:p>
+        </w:tc>
+        <w:tc>
+          <w:tcPr>
+            <w:tcW w:type="dxa" w:w="4320"/>
+          </w:tcPr>
+          <w:p>
+            <w:r>
+              <w:rPr>
+                <w:sz w:val="20"/>
+              </w:rPr>
+            </w:r>
+            <w:r>
+              <w:rPr>
+                <w:sz w:val="20"/>
+              </w:rPr>
+              <w:t>Music or Visual Arts</w:t>
+            </w:r>
+          </w:p>
+        </w:tc>
+      </w:tr>
+      <w:tr>
+        <w:tc>
+          <w:tcPr>
+            <w:tcW w:type="dxa" w:w="4320"/>
+          </w:tcPr>
+          <w:p>
+            <w:r>
+              <w:rPr>
+                <w:sz w:val="20"/>
+              </w:rPr>
+            </w:r>
+            <w:r>
+              <w:rPr>
+                <w:sz w:val="20"/>
+              </w:rPr>
+              <w:t>6th – 8th Grade</w:t>
+            </w:r>
+          </w:p>
+        </w:tc>
+        <w:tc>
+          <w:tcPr>
+            <w:tcW w:type="dxa" w:w="4320"/>
+          </w:tcPr>
+          <w:p>
+            <w:r>
+              <w:rPr>
+                <w:sz w:val="20"/>
+              </w:rPr>
+            </w:r>
+            <w:r>
+              <w:rPr>
+                <w:sz w:val="20"/>
+              </w:rPr>
+              <w:t>Dance, Film, or Theatre</w:t>
+            </w:r>
+          </w:p>
+        </w:tc>
+      </w:tr>
+      <w:tr>
+        <w:tc>
+          <w:tcPr>
+            <w:tcW w:type="dxa" w:w="4320"/>
+          </w:tcPr>
+          <w:p>
+            <w:r>
+              <w:rPr>
+                <w:sz w:val="20"/>
+              </w:rPr>
+            </w:r>
+            <w:r>
+              <w:rPr>
+                <w:sz w:val="20"/>
+              </w:rPr>
+              <w:t>9th – 12th Grade</w:t>
+            </w:r>
+          </w:p>
+        </w:tc>
+        <w:tc>
+          <w:tcPr>
+            <w:tcW w:type="dxa" w:w="4320"/>
+          </w:tcPr>
+          <w:p>
+            <w:r>
+              <w:rPr>
+                <w:sz w:val="20"/>
+              </w:rPr>
+            </w:r>
+            <w:r>
+              <w:rPr>
+                <w:sz w:val="20"/>
+              </w:rPr>
+              <w:t>Film or Theatre</w:t>
+            </w:r>
+          </w:p>
+        </w:tc>
+      </w:tr>
+    </w:tbl>
+    <w:p/>
+    <w:p>
+      <w:r>
+        <w:t xml:space="preserve">IMPORTANT DISCIPLINE FLAG: Theatre is only an eligible discipline for the 6-8 and 9-12 bands. If this application is filed under "Theatre," it is only eligible for grades 6-8 or 9-12 — not K-2 or 3-5. However, Step Afrika! is officially a dance company (its own materials describe it as an "internationally acclaimed Dance Company"), so this trip can reasonably be classified under </w:t>
+      </w:r>
+      <w:r>
+        <w:rPr>
+          <w:b/>
+        </w:rPr>
+        <w:t>Dance</w:t>
+      </w:r>
+      <w:r>
+        <w:t xml:space="preserve"> instead of Theatre — which is an eligible discipline for K-2, 3-5, AND 6-8. Recommend classifying this application under Dance and picking ONE band from K-2, 3-5, or 6-8 (not a 5-14 span). This is a decision for Neo: GOODLearningHub's exact grade breakdown (not just ages) within its 73 enrolled students needs to be pulled to pick the band with the most eligible students. Our current 30-youth, ages-5-14 framing must be narrowed before submission or the application risks disqualification for not targeting a single grade grouping.</w:t>
       </w:r>
     </w:p>
     <w:p>
@@ -1474,7 +1843,7 @@
               <w:rPr>
                 <w:sz w:val="20"/>
               </w:rPr>
-              <w:t>Final report only, or per CAH's specific requirement once confirmed</w:t>
+              <w:t>Final Report only, due Friday, October 15, 2027 — confirmed from RFA; Interim Report only required for awards over $12,500, which does not apply to our $5,500 ask</w:t>
             </w:r>
           </w:p>
         </w:tc>
@@ -2109,6 +2478,43 @@
       </w:r>
     </w:p>
     <w:p>
+      <w:r>
+        <w:t>COST CAP COMPLIANCE (per RFA Section IV.H, checked against the budget above):</w:t>
+      </w:r>
+    </w:p>
+    <w:p>
+      <w:pPr>
+        <w:pStyle w:val="ListBullet"/>
+      </w:pPr>
+      <w:r>
+        <w:t>Staff salaries may not exceed 35% of the grant request. Our staff planning/coordination line is $1,500 of $5,500 = 27%. Compliant.</w:t>
+      </w:r>
+    </w:p>
+    <w:p>
+      <w:pPr>
+        <w:pStyle w:val="ListBullet"/>
+      </w:pPr>
+      <w:r>
+        <w:t>Materials/supplies/equipment may not exceed 25% of the award. Our workshop materials line is $500 of $5,500 = 9%. Compliant.</w:t>
+      </w:r>
+    </w:p>
+    <w:p>
+      <w:pPr>
+        <w:pStyle w:val="ListBullet"/>
+      </w:pPr>
+      <w:r>
+        <w:t>Unallowable costs include food/beverages, tuition, fundraiser costs, debt reduction, and operational reserve — none of these appear in our budget. Confirmed clean.</w:t>
+      </w:r>
+    </w:p>
+    <w:p>
+      <w:pPr>
+        <w:pStyle w:val="ListBullet"/>
+      </w:pPr>
+      <w:r>
+        <w:t>Interim Report threshold is $12,500 — our $5,500 ask stays under it, so only a Final Report is required (due Friday, October 15, 2027), consistent with what the draft already assumed.</w:t>
+      </w:r>
+    </w:p>
+    <w:p>
       <w:pPr>
         <w:pStyle w:val="Heading2"/>
       </w:pPr>
@@ -2117,11 +2523,8 @@
       </w:r>
     </w:p>
     <w:p>
-      <w:pPr>
-        <w:pStyle w:val="ListBullet"/>
-      </w:pPr>
       <w:r>
-        <w:t>[x] 501(c)(3) Determination Letter — on file</w:t>
+        <w:t>REBUILT from the actual FY27 FTE RFA (Section IV.E), which lists 14 mandatory documents — this is a substantially longer list than the prior draft tracked, and several items need real lead time (Board approval, an insurance certificate) that should start now given the July 24 deadline.</w:t>
       </w:r>
     </w:p>
     <w:p>
@@ -2129,7 +2532,7 @@
         <w:pStyle w:val="ListBullet"/>
       </w:pPr>
       <w:r>
-        <w:t>[x] Certificate of Good Standing (DC) — on file</w:t>
+        <w:t>[ ] 1. Work Samples — video/audio of the field trip or a comparable experience, no more than 3 years old. NOT YET COMPILED. This is the highest-weighted content item in scoring (feeds directly into the 40-point Arts/Humanities/Arts Education Merit criterion) — needs real attention, not just a placeholder.</w:t>
       </w:r>
     </w:p>
     <w:p>
@@ -2137,7 +2540,7 @@
         <w:pStyle w:val="ListBullet"/>
       </w:pPr>
       <w:r>
-        <w:t>[ ] Business License — NOT ON FILE, same gap flagged on the Events DC draft</w:t>
+        <w:t>[ ] 2. Support Materials — up to 3 items (letters of support, syllabi, lesson plans, etc.). NOT YET COMPILED. A letter of support from a partner school (Amidon-Bowen or Jefferson MS) would also help satisfy the RFA's goal of "authentic connections... in collaboration with appropriate personnel at DCPS/DCPCS," which our narrative doesn't currently address.</w:t>
       </w:r>
     </w:p>
     <w:p>
@@ -2145,7 +2548,7 @@
         <w:pStyle w:val="ListBullet"/>
       </w:pPr>
       <w:r>
-        <w:t>[x] Clean Hands Certificate — on file, issued 4/23/2026; reconfirm currency at submission</w:t>
+        <w:t>[ ] 3. Résumés of Key Personnel — must include role, area of responsibility, AND ward or state of residence. NOT YET COMPILED for Phileke Holland, Stephanie Page-Baxter, or other staff involved.</w:t>
       </w:r>
     </w:p>
     <w:p>
@@ -2153,7 +2556,7 @@
         <w:pStyle w:val="ListBullet"/>
       </w:pPr>
       <w:r>
-        <w:t>[x] Most recent audited financial statements (FY2024, Desai Company) — on file</w:t>
+        <w:t>[ ] 4. Budget Form — CAH's own detailed budget form/template, not just our internal budget table above. NOT YET SOURCED from the grants portal.</w:t>
       </w:r>
     </w:p>
     <w:p>
@@ -2161,7 +2564,7 @@
         <w:pStyle w:val="ListBullet"/>
       </w:pPr>
       <w:r>
-        <w:t>[x] Board of Directors list with affiliations — available</w:t>
+        <w:t>[x] 5. Certificate of Clean Hands — on file, but ISSUED 4/23/2026. The RFA requires this be issued within 30 days of the application deadline (i.e., after ~June 24, 2026). The one on file is roughly 3 months old and will almost certainly need to be REISSUED before submission.</w:t>
       </w:r>
     </w:p>
     <w:p>
@@ -2169,7 +2572,76 @@
         <w:pStyle w:val="ListBullet"/>
       </w:pPr>
       <w:r>
-        <w:t>[ ] Agency-specific attachment (e.g., letter of commitment from Arena Stage, if CAH requires one) — not yet obtained</w:t>
+        <w:t>[ ] 6. Statement of Certification — date must match the FTE application submission date. NOT YET DONE (can't be done until submission date is set).</w:t>
+      </w:r>
+    </w:p>
+    <w:p>
+      <w:pPr>
+        <w:pStyle w:val="ListBullet"/>
+      </w:pPr>
+      <w:r>
+        <w:t>[ ] 7. Signed IRS Form W-9 — must be the March 2024 version, dated to match the submission date, and the address must match both the grants portal and DC's Integrated Financial System (DIFS). NOT YET CONFIRMED current.</w:t>
+      </w:r>
+    </w:p>
+    <w:p>
+      <w:pPr>
+        <w:pStyle w:val="ListBullet"/>
+      </w:pPr>
+      <w:r>
+        <w:t>[ ] 8. Certificate of Liability Insurance (general coverage, with a written waiver of subrogation). STATUS UNKNOWN — need to check with Cole Bradshaw (Finance &amp; Operations) whether GOODProjects has this on file; this can take time to obtain if not.</w:t>
+      </w:r>
+    </w:p>
+    <w:p>
+      <w:pPr>
+        <w:pStyle w:val="ListBullet"/>
+      </w:pPr>
+      <w:r>
+        <w:t>[ ] 9. Balance Sheet — from the most recently completed fiscal year. NOT YET SOURCED.</w:t>
+      </w:r>
+    </w:p>
+    <w:p>
+      <w:pPr>
+        <w:pStyle w:val="ListBullet"/>
+      </w:pPr>
+      <w:r>
+        <w:t>[ ] 10. Current Organizational Budget — must be approved by the Board of Directors. NOT YET SOURCED — confirm this exists and is Board-approved, not just staff-drafted.</w:t>
+      </w:r>
+    </w:p>
+    <w:p>
+      <w:pPr>
+        <w:pStyle w:val="ListBullet"/>
+      </w:pPr>
+      <w:r>
+        <w:t>[x] 11. IRS 501(c)(3) Determination Letter — on file.</w:t>
+      </w:r>
+    </w:p>
+    <w:p>
+      <w:pPr>
+        <w:pStyle w:val="ListBullet"/>
+      </w:pPr>
+      <w:r>
+        <w:t>[ ] 12. IRS Form 990 — most recently filed. NOT YET SOURCED.</w:t>
+      </w:r>
+    </w:p>
+    <w:p>
+      <w:pPr>
+        <w:pStyle w:val="ListBullet"/>
+      </w:pPr>
+      <w:r>
+        <w:t>[ ] 13. List of current Board of Directors — RFA requires roles (president, treasurer, etc.), responsibilities, AND home addresses/wards, not just a general affiliations list. Our existing "Board of Directors list with affiliations" likely needs augmenting with ward/address data.</w:t>
+      </w:r>
+    </w:p>
+    <w:p>
+      <w:pPr>
+        <w:pStyle w:val="ListBullet"/>
+      </w:pPr>
+      <w:r>
+        <w:t>[ ] 14. Profit and Loss Statement — from the most recently completed fiscal quarter. NOT YET SOURCED.</w:t>
+      </w:r>
+    </w:p>
+    <w:p>
+      <w:r>
+        <w:t>ADDITIONAL REQUIREMENT (Section III.B): a sworn, written statement disclosing whether the applicant has been indicted or convicted of financial misconduct or fraud in the last 3 years. NOT YET DRAFTED — this is a required disclosure, not optional.</w:t>
       </w:r>
     </w:p>
     <w:p>
@@ -2217,7 +2689,7 @@
         <w:pStyle w:val="ListBullet"/>
       </w:pPr>
       <w:r>
-        <w:t>04a [ ] Grade-grouping requirement (single band vs. our 5-14 span) not yet resolved with Neo — see Target Population note</w:t>
+        <w:t>04a [ ] Grade-grouping requirement RESOLVED as a rule (must pick ONE band, recommend classifying under Dance) but the actual band + matching enrollment numbers still need Neo's decision — see Target Population note</w:t>
       </w:r>
     </w:p>
     <w:p>
@@ -2234,6 +2706,46 @@
       </w:pPr>
       <w:r>
         <w:t>04c [ ] Formal Group Sales ticket quote not yet obtained — $30/ticket is an estimate, not a confirmed rate</w:t>
+      </w:r>
+    </w:p>
+    <w:p>
+      <w:pPr>
+        <w:pStyle w:val="ListBullet"/>
+      </w:pPr>
+      <w:r>
+        <w:t>04d [ ] Business License / DLCP registration status unknown — confirm this isn't a baseline eligibility blocker, not just a missing attachment</w:t>
+      </w:r>
+    </w:p>
+    <w:p>
+      <w:pPr>
+        <w:pStyle w:val="ListBullet"/>
+      </w:pPr>
+      <w:r>
+        <w:t>04e [ ] GOS overlap check needed — has GOODProjects applied for FY27 CAH General Operating Support? If so, this FTE application must represent new/additional programming</w:t>
+      </w:r>
+    </w:p>
+    <w:p>
+      <w:pPr>
+        <w:pStyle w:val="ListBullet"/>
+      </w:pPr>
+      <w:r>
+        <w:t>04f [ ] Clean Hands Certificate on file is dated 4/23/2026 — RFA requires issuance within 30 days of the July 24 deadline; will need reissuing</w:t>
+      </w:r>
+    </w:p>
+    <w:p>
+      <w:pPr>
+        <w:pStyle w:val="ListBullet"/>
+      </w:pPr>
+      <w:r>
+        <w:t>04g [ ] 9 of the 14 required RFA attachments are not yet compiled (Work Samples, Support Materials, Résumés with ward info, CAH Budget Form, Statement of Certification, current W-9, Liability Insurance Certificate, Balance Sheet, Board-approved Org Budget, Form 990, P&amp;L Statement) — see full attachments checklist. This is a substantially larger lift than previously tracked; some items (insurance certificate, Board-approved budget) need real lead time before July 24.</w:t>
+      </w:r>
+    </w:p>
+    <w:p>
+      <w:pPr>
+        <w:pStyle w:val="ListBullet"/>
+      </w:pPr>
+      <w:r>
+        <w:t>04h [ ] Financial misconduct/fraud disclosure statement not yet drafted — required, not optional</w:t>
       </w:r>
     </w:p>
     <w:p>
@@ -2289,7 +2801,7 @@
         <w:pStyle w:val="ListBullet"/>
       </w:pPr>
       <w:r>
-        <w:t>11 [ ] Attachments not yet assembled</w:t>
+        <w:t>11 [ ] Attachments not yet assembled — see expanded 14-item checklist above</w:t>
       </w:r>
     </w:p>
     <w:p>
@@ -2314,6 +2826,14 @@
       </w:pPr>
       <w:r>
         <w:t>14 [ ] PDF not yet produced</w:t>
+      </w:r>
+    </w:p>
+    <w:p>
+      <w:pPr>
+        <w:pStyle w:val="ListBullet"/>
+      </w:pPr>
+      <w:r>
+        <w:t>15 [ ] Technical assistance appointment with CAH (Andrea Brown) not yet booked — window closes Friday, July 17, 2026, given the volume of open items above</w:t>
       </w:r>
     </w:p>
     <w:p>
@@ -2520,35 +3040,49 @@
         <w:rPr>
           <w:b/>
         </w:rPr>
-        <w:t>One open question for Neo:</w:t>
+        <w:t>Confirmed from the actual RFA text (not a prior-year guess anymore):</w:t>
       </w:r>
       <w:r>
-        <w:t xml:space="preserve"> prior-year CAH guidance required applicants to target a single</w:t>
+        <w:t xml:space="preserve"> organizations must target</w:t>
       </w:r>
     </w:p>
     <w:p>
       <w:r>
-        <w:t>grade grouping aligned with DCPS's arts curriculum (roughly PreK-2 / 3-5 / 6-8 bands), not a wide</w:t>
+        <w:t>exactly ONE grade grouping, each tied to specific disciplines — K-2 (Dance/Music/Visual Arts), 3-5</w:t>
       </w:r>
     </w:p>
     <w:p>
       <w:r>
-        <w:t>span. Our 5-14 range likely crosses two or three of those bands. Before submitting, we need a</w:t>
+        <w:t>(Music/Visual Arts), 6-8 (Dance/Film/Theatre), 9-12 (Film/Theatre). Theatre alone would restrict us</w:t>
       </w:r>
     </w:p>
     <w:p>
       <w:r>
-        <w:t>call on whether to (a) narrow the cohort to one band — elementary-age fits this show best — or</w:t>
+        <w:t>to grades 6-12 only. Since Step Afrika! is officially a dance company, we can classify this trip</w:t>
       </w:r>
     </w:p>
     <w:p>
       <w:r>
-        <w:t>(b) confirm directly with CAH that a mixed afterschool cohort is acceptable. This hasn't been</w:t>
+        <w:t xml:space="preserve">under </w:t>
+      </w:r>
+      <w:r>
+        <w:rPr>
+          <w:b/>
+        </w:rPr>
+        <w:t>Dance</w:t>
+      </w:r>
+      <w:r>
+        <w:t xml:space="preserve"> instead, which opens up K-2, 3-5, or 6-8. We still need Neo's call on which single</w:t>
       </w:r>
     </w:p>
     <w:p>
       <w:r>
-        <w:t>checked against the actual FY27 RFA text yet.</w:t>
+        <w:t>band to pick, and GOODLearningHub's actual grade breakdown (not just ages) to support that choice.</w:t>
+      </w:r>
+    </w:p>
+    <w:p>
+      <w:r>
+        <w:t>Our current 30-youth, ages-5-14 framing needs to narrow to one band before submission.</w:t>
       </w:r>
     </w:p>
     <w:p>
@@ -3052,7 +3586,7 @@
         <w:pStyle w:val="ListNumber"/>
       </w:pPr>
       <w:r>
-        <w:t>Grade-grouping question above</w:t>
+        <w:t>Which single grade grouping to target (see above)</w:t>
       </w:r>
     </w:p>
     <w:p>
@@ -3079,6 +3613,55 @@
     <w:p>
       <w:r>
         <w:t>(see correction above), but may still matter for other parts of the application</w:t>
+      </w:r>
+    </w:p>
+    <w:p>
+      <w:pPr>
+        <w:pStyle w:val="ListNumber"/>
+      </w:pPr>
+      <w:r>
+        <w:t>Whether GOODProjects' Business License/DLCP registration is actually on file — this showed up</w:t>
+      </w:r>
+    </w:p>
+    <w:p>
+      <w:r>
+        <w:t>as a missing attachment before, but the RFA lists DLCP registration as a baseline eligibility</w:t>
+      </w:r>
+    </w:p>
+    <w:p>
+      <w:r>
+        <w:t>requirement, which is a bigger deal than a missing document</w:t>
+      </w:r>
+    </w:p>
+    <w:p>
+      <w:pPr>
+        <w:pStyle w:val="ListNumber"/>
+      </w:pPr>
+      <w:r>
+        <w:t>Whether GOODProjects applied for CAH's FY27 General Operating Support grant — if so, this</w:t>
+      </w:r>
+    </w:p>
+    <w:p>
+      <w:r>
+        <w:t>application must represent new/additional programming beyond that scope</w:t>
+      </w:r>
+    </w:p>
+    <w:p>
+      <w:pPr>
+        <w:pStyle w:val="ListNumber"/>
+      </w:pPr>
+      <w:r>
+        <w:t>9 of the RFA's 14 required attachments are not yet compiled (see full checklist in the grant</w:t>
+      </w:r>
+    </w:p>
+    <w:p>
+      <w:r>
+        <w:t>draft above) — this is a much bigger lift than originally scoped, and a few items (a liability</w:t>
+      </w:r>
+    </w:p>
+    <w:p>
+      <w:r>
+        <w:t>insurance certificate, a Board-approved organizational budget) need real lead time before July 24</w:t>
       </w:r>
     </w:p>
     <w:p>

</xml_diff>

<commit_message>
Strengthen application using cross-checked Abacus recommendations
Adopted: recommend 6th-8th grade / Dance classification, richer
thematic framing around stepping as Black cultural heritage, explicit
"producer of the field trip experience" language, a scoring-strategy
section mapped to the RFA's four review categories, and a caution
against relying on hyperlinks for evidence panelists won't click
through to.

Not adopted: Abacus's claim that GOODProjects likely doesn't qualify
as the experience's "producer." Checked against the full RFA text
(Section I explicitly names "presenting or producing organizations"
as eligible and funds ticket costs, which only makes sense under a
presenting-org model) — the concern doesn't hold up, so the narrative
addresses it directly instead of pivoting to an unscoped new concept.
</commit_message>
<xml_diff>
--- a/app/drafts/exports/DC Arts and Humanities FTE Grant Draft.docx
+++ b/app/drafts/exports/DC Arts and Humanities FTE Grant Draft.docx
@@ -531,7 +531,35 @@
     </w:p>
     <w:p>
       <w:r>
-        <w:t>GOODProjects requests $5,500 to provide a GOODLearningHub arts and humanities field trip experience: a weekday matinee performance of Step Afrika!'s Magical Musical Holiday Step Show at Arena Stage, a professional theater in Southwest DC, for youth enrolled in GOODLearningHub. This production was chosen specifically for this age group and community: it is Arena Stage's annual family-friendly holiday production, built around the African American tradition of stepping, and runs December 4–23, 2026, inside GOODLearningHub's Fall II session (Nov 30 – Dec 17, 2026). This directly matches CAH's Field Trip Experiences goal of providing comprehensive arts and humanities field trip experiences that advance student achievement, paired with pre- and post-trip workshops and professional development for staff.</w:t>
+        <w:t xml:space="preserve">GOODProjects requests $5,500 to produce a GOODLearningHub arts and humanities field trip experience for 6th-8th grade youth, centered on </w:t>
+      </w:r>
+      <w:r>
+        <w:rPr>
+          <w:b/>
+        </w:rPr>
+        <w:t>dance as a discipline</w:t>
+      </w:r>
+      <w:r>
+        <w:t>: a weekday matinee performance of Step Afrika!'s Magical Musical Holiday Step Show at Arena Stage, a professional dance company performance in Southwest DC. GOODProjects is the producer of the field trip experience itself — the curriculum design, pre-trip workshop, chaperoning, on-site learning components, and post-trip reflection — while Arena Stage/Step Afrika produces the underlying performance, consistent with CAH's own eligibility framing of "arts or humanities presenting or producing organizations" and its explicit funding of field trip ticket costs.</w:t>
+      </w:r>
+    </w:p>
+    <w:p>
+      <w:r>
+        <w:t>This experience is framed around stepping as a living Black American cultural and historical tradition rooted in HBCU life, community, and storytelling — not just an outing. Pre- and post-trip workshops connect the performance's themes to identity, community history, and creative voice, giving students a structured arts-education experience rather than a one-off entertainment trip. This directly matches CAH's Field Trip Experiences goal of providing comprehensive arts and humanities field trip experiences that advance student achievement, paired with pre- and post-trip workshops and professional development for staff. This production was chosen specifically for this age group and community: it is Arena Stage's annual family-friendly holiday production, built around the African American tradition of stepping, and runs December 4–23, 2026, inside GOODLearningHub's Fall II session (Nov 30 – Dec 17, 2026).</w:t>
+      </w:r>
+    </w:p>
+    <w:p>
+      <w:r>
+        <w:t xml:space="preserve">GRADE GROUPING AND DISCIPLINE: this application targets the </w:t>
+      </w:r>
+      <w:r>
+        <w:rPr>
+          <w:b/>
+        </w:rPr>
+        <w:t>6th-8th grade band under the Dance discipline</w:t>
+      </w:r>
+      <w:r>
+        <w:t xml:space="preserve"> (one of three disciplines allowed for that band, alongside Film and Theatre). This band was chosen over K-2 or 3-5 (also Dance-eligible) because the stepping tradition's historical and identity-based content connects most authentically to middle-grade SEL and civics content, and because the RFA's community-impact criteria reward developmentally appropriate, curriculum-connected content over a younger audience. GOODLearningHub's exact 6-8 grade enrollment count within its 73 students still needs to be pulled to confirm 30 participants can be drawn from this band alone — this is a decision for Neo/Stephanie, not yet finalized.</w:t>
       </w:r>
     </w:p>
     <w:p>
@@ -992,7 +1020,35 @@
         <w:t>Dance</w:t>
       </w:r>
       <w:r>
-        <w:t xml:space="preserve"> instead of Theatre — which is an eligible discipline for K-2, 3-5, AND 6-8. Recommend classifying this application under Dance and picking ONE band from K-2, 3-5, or 6-8 (not a 5-14 span). This is a decision for Neo: GOODLearningHub's exact grade breakdown (not just ages) within its 73 enrolled students needs to be pulled to pick the band with the most eligible students. Our current 30-youth, ages-5-14 framing must be narrowed before submission or the application risks disqualification for not targeting a single grade grouping.</w:t>
+        <w:t xml:space="preserve"> instead of Theatre — which is an eligible discipline for K-2, 3-5, AND 6-8.</w:t>
+      </w:r>
+    </w:p>
+    <w:p>
+      <w:r>
+        <w:t xml:space="preserve">RECOMMENDATION (updated after cross-checking an internal GOODProjects Abacus review against the actual RFA text): classify this application as </w:t>
+      </w:r>
+      <w:r>
+        <w:rPr>
+          <w:b/>
+        </w:rPr>
+        <w:t>Dance, 6th-8th grade</w:t>
+      </w:r>
+      <w:r>
+        <w:t>. GOODLearningHub's exact grade breakdown (not just ages) within its 73 enrolled students still needs to be pulled to confirm 30 participants can be drawn from that single band — this is a decision for Neo/Stephanie, not yet finalized. Our current 30-youth, ages-5-14 framing must be narrowed before submission or the application risks disqualification for not targeting a single grade grouping.</w:t>
+      </w:r>
+    </w:p>
+    <w:p>
+      <w:r>
+        <w:t xml:space="preserve">ON THE "PRODUCER" REQUIREMENT: the RFA states "the applicant organization must be the producer of the arts or humanities field trip experience." An internal Abacus review flagged this as a possible disqualifier, reasoning that GOODProjects isn't itself a dance/theater company. That reading doesn't hold up against the full RFA text: Section I explicitly frames eligible applicants as "arts or humanities </w:t>
+      </w:r>
+      <w:r>
+        <w:rPr>
+          <w:b/>
+        </w:rPr>
+        <w:t>presenting or producing</w:t>
+      </w:r>
+      <w:r>
+        <w:t xml:space="preserve"> organizations," and the same section funds "the cost of field trip tickets" — which only makes sense if the intended model is an organization taking students to see a professional production it did not itself create. Read in full context, GOODProjects is the producer of the *field trip experience* (workshops, logistics, curriculum connections, chaperoning, reflection); Arena Stage/Step Afrika produces the underlying performance. This should be stated explicitly in the narrative rather than left ambiguous, since a reviewer could make the same overly literal read Abacus did.</w:t>
       </w:r>
     </w:p>
     <w:p>
@@ -1850,6 +1906,122 @@
       </w:tr>
     </w:tbl>
     <w:p/>
+    <w:p>
+      <w:pPr>
+        <w:pStyle w:val="Heading3"/>
+      </w:pPr>
+      <w:r>
+        <w:t>Scoring Strategy Notes (mapped to RFA Section V review criteria)</w:t>
+      </w:r>
+    </w:p>
+    <w:p>
+      <w:r>
+        <w:t>The RFA scores applications across four weighted categories. Notes below incorporate a cross-checked internal Abacus review, applied only where it holds up against the RFA text itself.</w:t>
+      </w:r>
+    </w:p>
+    <w:p>
+      <w:r>
+        <w:rPr>
+          <w:b/>
+        </w:rPr>
+        <w:t>Arts, Humanities, and Arts Education Merit — 40 points (the largest category).</w:t>
+      </w:r>
+      <w:r>
+        <w:t xml:space="preserve"> CAH's own guidance says panelists review only what is physically in the application — reliance on hyperlinks or "the website has more info" will not help, since panelists are not expected to click through to outside content. Everything below needs to be uploaded as an actual document, not linked:</w:t>
+      </w:r>
+    </w:p>
+    <w:p>
+      <w:pPr>
+        <w:pStyle w:val="ListBullet"/>
+      </w:pPr>
+      <w:r>
+        <w:t>A sample lesson plan for the pre-trip SEL/identity workshop</w:t>
+      </w:r>
+    </w:p>
+    <w:p>
+      <w:pPr>
+        <w:pStyle w:val="ListBullet"/>
+      </w:pPr>
+      <w:r>
+        <w:t>A workshop outline for the post-trip reflection session</w:t>
+      </w:r>
+    </w:p>
+    <w:p>
+      <w:pPr>
+        <w:pStyle w:val="ListBullet"/>
+      </w:pPr>
+      <w:r>
+        <w:t>Educational materials/handouts used with students</w:t>
+      </w:r>
+    </w:p>
+    <w:p>
+      <w:pPr>
+        <w:pStyle w:val="ListBullet"/>
+      </w:pPr>
+      <w:r>
+        <w:t>Any comparable prior arts-enriched programming GOODProjects has run (photos, records, testimonials)</w:t>
+      </w:r>
+    </w:p>
+    <w:p>
+      <w:pPr>
+        <w:pStyle w:val="ListBullet"/>
+      </w:pPr>
+      <w:r>
+        <w:t>Short video/photo work samples, no more than 3 years old</w:t>
+      </w:r>
+    </w:p>
+    <w:p>
+      <w:pPr>
+        <w:pStyle w:val="ListBullet"/>
+      </w:pPr>
+      <w:r>
+        <w:t>Bios of the facilitators/teaching artists involved (GOODLearningHub staff and/or Arena Stage teaching artists via the Interactive add-on)</w:t>
+      </w:r>
+    </w:p>
+    <w:p>
+      <w:r>
+        <w:rPr>
+          <w:b/>
+        </w:rPr>
+        <w:t>Capacity &amp; Sustainability — 20 points.</w:t>
+      </w:r>
+      <w:r>
+        <w:t xml:space="preserve"> GOODProjects' existing strengths apply directly here: a real DC office, an active board, grant management and audit experience from public funding, established program infrastructure. Include an org chart, current budget, financial statements, and staffing roles specific to this project.</w:t>
+      </w:r>
+    </w:p>
+    <w:p>
+      <w:r>
+        <w:rPr>
+          <w:b/>
+        </w:rPr>
+        <w:t>Community Access &amp; Engagement — 20 points.</w:t>
+      </w:r>
+      <w:r>
+        <w:t xml:space="preserve"> Be explicit, not implicit, about: no-cost participation for all 30 families, transportation provided (not an out-of-pocket ask), ADA accessibility at Arena Stage, language access if needed for families, and culturally responsive content (the stepping tradition itself is part of this story, not incidental to it).</w:t>
+      </w:r>
+    </w:p>
+    <w:p>
+      <w:r>
+        <w:rPr>
+          <w:b/>
+        </w:rPr>
+        <w:t>Community Impact — 20 points.</w:t>
+      </w:r>
+      <w:r>
+        <w:t xml:space="preserve"> State plainly: exact number of students and staff served, the evaluation method already in the metrics table above, and that teaching artists/facilitators involved are DC-based (Arena Stage is a DC institution; GOODLearningHub staff are DC-based), which speaks directly to the RFA's "DC-based hiring" scoring point.</w:t>
+      </w:r>
+    </w:p>
+    <w:p>
+      <w:r>
+        <w:rPr>
+          <w:b/>
+        </w:rPr>
+        <w:t>What to avoid:</w:t>
+      </w:r>
+      <w:r>
+        <w:t xml:space="preserve"> this narrative should read as an arts/humanities education proposal with a field trip at its center — not a youth-services or violence-prevention proposal with "arts" added on. GOODProjects' broader mission (violence prevention, family stabilization, workforce development, food security) should not be foregrounded in this application; it is real and valuable work, but it is not what this specific grant funds or scores.</w:t>
+      </w:r>
+    </w:p>
     <w:p>
       <w:pPr>
         <w:pStyle w:val="Heading2"/>
@@ -2837,6 +3009,30 @@
       </w:r>
     </w:p>
     <w:p>
+      <w:pPr>
+        <w:pStyle w:val="ListBullet"/>
+      </w:pPr>
+      <w:r>
+        <w:t>16 [x] "Producer of the field trip experience" requirement addressed explicitly in the narrative (Program Purpose section), rather than left ambiguous — resolves a disqualification concern raised by an internal Abacus review that didn't hold up against the full RFA text</w:t>
+      </w:r>
+    </w:p>
+    <w:p>
+      <w:pPr>
+        <w:pStyle w:val="ListBullet"/>
+      </w:pPr>
+      <w:r>
+        <w:t>17 [ ] All Arts Merit evidence (lesson plans, workshop outline, work samples, facilitator bios) still needs to be gathered and uploaded as actual documents — CAH panelists do not click through to outside links or websites</w:t>
+      </w:r>
+    </w:p>
+    <w:p>
+      <w:pPr>
+        <w:pStyle w:val="ListBullet"/>
+      </w:pPr>
+      <w:r>
+        <w:t>18 [ ] Narrative reviewed to confirm it stays centered on arts/humanities education, not GOODProjects' broader youth-services mission</w:t>
+      </w:r>
+    </w:p>
+    <w:p>
       <w:r>
         <w:br/>
       </w:r>
@@ -3072,17 +3268,68 @@
         <w:t>Dance</w:t>
       </w:r>
       <w:r>
-        <w:t xml:space="preserve"> instead, which opens up K-2, 3-5, or 6-8. We still need Neo's call on which single</w:t>
+        <w:t xml:space="preserve"> instead, which opens up K-2, 3-5, or 6-8.</w:t>
       </w:r>
     </w:p>
     <w:p>
       <w:r>
-        <w:t>band to pick, and GOODLearningHub's actual grade breakdown (not just ages) to support that choice.</w:t>
+        <w:rPr>
+          <w:b/>
+        </w:rPr>
+        <w:t>Recommendation: 6th-8th grade, Dance.</w:t>
+      </w:r>
+      <w:r>
+        <w:t xml:space="preserve"> This came out of cross-checking an internal GOODProjects</w:t>
       </w:r>
     </w:p>
     <w:p>
       <w:r>
-        <w:t>Our current 30-youth, ages-5-14 framing needs to narrow to one band before submission.</w:t>
+        <w:t>Abacus review against the RFA — Abacus's specific suggestion to reclassify by discipline was</w:t>
+      </w:r>
+    </w:p>
+    <w:p>
+      <w:r>
+        <w:t>sound, and 6-8 is the strongest fit because stepping's identity/community-history content connects</w:t>
+      </w:r>
+    </w:p>
+    <w:p>
+      <w:r>
+        <w:t>more naturally to middle-grade SEL and civics content than to younger grades. Abacus separately</w:t>
+      </w:r>
+    </w:p>
+    <w:p>
+      <w:r>
+        <w:t>raised a concern that GOODProjects might not qualify as the "producer" of the field trip since we</w:t>
+      </w:r>
+    </w:p>
+    <w:p>
+      <w:r>
+        <w:t>aren't a dance company ourselves — I checked that against the full RFA text and it doesn't hold up:</w:t>
+      </w:r>
+    </w:p>
+    <w:p>
+      <w:r>
+        <w:t>the RFA explicitly names "presenting or producing organizations" as eligible and funds "field trip</w:t>
+      </w:r>
+    </w:p>
+    <w:p>
+      <w:r>
+        <w:t>tickets," which only makes sense under a presenting-org model. We've stated this explicitly in the</w:t>
+      </w:r>
+    </w:p>
+    <w:p>
+      <w:r>
+        <w:t>narrative so a reviewer doesn't make the same overly literal read. Still need Neo's/Stephanie's call</w:t>
+      </w:r>
+    </w:p>
+    <w:p>
+      <w:r>
+        <w:t>on GOODLearningHub's actual 6-8 grade enrollment count to confirm 30 participants can be drawn from</w:t>
+      </w:r>
+    </w:p>
+    <w:p>
+      <w:r>
+        <w:t>that band alone.</w:t>
       </w:r>
     </w:p>
     <w:p>
@@ -3665,34 +3912,56 @@
       </w:r>
     </w:p>
     <w:p>
+      <w:pPr>
+        <w:pStyle w:val="ListNumber"/>
+      </w:pPr>
       <w:r>
-        <w:rPr>
-          <w:b/>
-        </w:rPr>
-        <w:t>One caution:</w:t>
-      </w:r>
-      <w:r>
-        <w:t xml:space="preserve"> during this research, an AI search tool (Perplexity) also produced three named</w:t>
+        <w:t>Arts Merit evidence (lesson plans, workshop outline, work samples, facilitator bios) needs to be</w:t>
       </w:r>
     </w:p>
     <w:p>
       <w:r>
-        <w:t>Arena Stage staff contacts (with titles and emails) that could not be independently verified</w:t>
+        <w:t>pulled together and uploaded directly — CAH panelists don't click through to outside links, so</w:t>
       </w:r>
     </w:p>
     <w:p>
       <w:r>
-        <w:t>anywhere on Arena Stage's own site. Those names are not used anywhere in this document —</w:t>
+        <w:t>nothing here can lean on "more info is on our website"</w:t>
       </w:r>
     </w:p>
     <w:p>
       <w:r>
-        <w:t>recommend getting any named contact by calling Arena Stage directly rather than trusting either</w:t>
+        <w:t>**Two cautions on AI tool output in this process, for the same reason Neo flagged earlier this</w:t>
       </w:r>
     </w:p>
     <w:p>
       <w:r>
-        <w:t>AI tool's output on that point.</w:t>
+        <w:t>week:** (1) an AI search tool (Perplexity) produced three named Arena Stage staff contacts that</w:t>
+      </w:r>
+    </w:p>
+    <w:p>
+      <w:r>
+        <w:t>could not be independently verified anywhere on Arena Stage's own site — not used anywhere in this</w:t>
+      </w:r>
+    </w:p>
+    <w:p>
+      <w:r>
+        <w:t>document. (2) A GOODProjects internal Abacus review raised a "producer of the experience" concern</w:t>
+      </w:r>
+    </w:p>
+    <w:p>
+      <w:r>
+        <w:t>that, read against the full RFA text rather than one isolated sentence, does not actually hold up —</w:t>
+      </w:r>
+    </w:p>
+    <w:p>
+      <w:r>
+        <w:t>addressed directly in the narrative rather than silently accepted. Both are a reminder to verify</w:t>
+      </w:r>
+    </w:p>
+    <w:p>
+      <w:r>
+        <w:t>against source text before treating any AI tool's read as final, on this application or any other.</w:t>
       </w:r>
     </w:p>
     <w:p>

</xml_diff>

<commit_message>
Strip all em and en dashes across grant documents
Replaced every em/en dash with standard punctuation (periods, commas,
semicolons, colons, or "to" for ranges) across all three documents,
fixing the QA gate's own "no em or en dashes" requirement that had
been marked complete but wasn't actually met. Also fixed a rendering
bug the mechanical pass introduced in the budget table (dash
placeholders in the Match column had been converted to stray commas,
breaking the table), plus several comma splices and missing-subject
fragments left behind after the dash removal.
</commit_message>
<xml_diff>
--- a/app/drafts/exports/DC Arts and Humanities FTE Grant Draft.docx
+++ b/app/drafts/exports/DC Arts and Humanities FTE Grant Draft.docx
@@ -18,12 +18,12 @@
     </w:p>
     <w:p>
       <w:r>
-        <w:t>DC Commission on the Arts &amp; Humanities — FY27 Field Trip Experiences (FTE) Grant</w:t>
+        <w:t>DC Commission on the Arts &amp; Humanities: FY27 Field Trip Experiences (FTE) Grant</w:t>
       </w:r>
     </w:p>
     <w:p>
       <w:r>
-        <w:t>STATUS: Draft for Neo's go/no-go review. Not yet submitted. This proposes a NEW field trip GOODProjects has not yet run — Stephanie Page-Baxter or Phileke Holland should confirm this is deliverable before it goes out.</w:t>
+        <w:t>STATUS: Draft for Neo's go/no-go review. Not yet submitted. This proposes a NEW field trip GOODProjects has not yet run. Stephanie Page-Baxter or Phileke Holland should confirm this is deliverable before it goes out.</w:t>
       </w:r>
     </w:p>
     <w:p>
@@ -163,7 +163,7 @@
               <w:rPr>
                 <w:sz w:val="20"/>
               </w:rPr>
-              <w:t>$5,500 (revised from $4,500 — see budget note below)</w:t>
+              <w:t>$5,500 (revised from $4,500: see budget note below)</w:t>
             </w:r>
           </w:p>
         </w:tc>
@@ -201,7 +201,7 @@
               <w:rPr>
                 <w:sz w:val="20"/>
               </w:rPr>
-              <w:t>Up to $30,000 — per the live FY27 FTE program page (dcarts.dc.gov/grants/field-trip-experiences), verified directly by Dumisani on July 14, 2026. CORRECTION: an earlier pass in this draft cited $50,000 from a PDF ("CAH FY 2027 Guide to Grants") snippet — that figure was wrong; the live program page is the authoritative source and shows $30,000. Our ask is still well under the cap.</w:t>
+              <w:t>Up to $30,000: per the live FY27 FTE program page (dcarts.dc.gov/grants/field-trip-experiences), verified directly by Dumisani on July 14, 2026. CORRECTION: an earlier pass in this draft cited $50,000 from a PDF ("CAH FY 2027 Guide to Grants") snippet. That figure was wrong; the live program page is the authoritative source and shows $30,000. Our ask is still well under the cap.</w:t>
             </w:r>
           </w:p>
         </w:tc>
@@ -239,7 +239,7 @@
               <w:rPr>
                 <w:sz w:val="20"/>
               </w:rPr>
-              <w:t>5:00 PM ET, Thursday, July 24, 2026 — confirmed directly from the live FY27 FTE program page (dcarts.dc.gov/grants/field-trip-experiences). Program released Tuesday, June 23, 2026. This resolves the earlier July 24 vs. July 27 discrepancy in Neo's favor of July 24.</w:t>
+              <w:t>5:00 PM ET, Thursday, July 24, 2026: confirmed directly from the live FY27 FTE program page (dcarts.dc.gov/grants/field-trip-experiences). Program released Tuesday, June 23, 2026. This resolves the earlier July 24 vs. July 27 discrepancy in Neo's favor of July 24.</w:t>
             </w:r>
           </w:p>
         </w:tc>
@@ -315,7 +315,7 @@
               <w:rPr>
                 <w:sz w:val="20"/>
               </w:rPr>
-              <w:t>Andrea Brown, Arts Learning Coordinator — andrea.brown3@dc.gov, (202) 671-2304. Commission on the Arts and Humanities, 200 I Street SE, Suite 1400, Washington, DC 20003. Confirmed directly from the RFA's Section VII (CAH Contact) — this name is safe to use, unlike the unverified names an AI search tool surfaced earlier in this process.</w:t>
+              <w:t>Andrea Brown, Arts Learning Coordinator: andrea.brown3@dc.gov, (202) 671-2304. Commission on the Arts and Humanities, 200 I Street SE, Suite 1400, Washington, DC 20003. Confirmed directly from the RFA's Section VII (CAH Contact); this name is safe to use, unlike the unverified names an AI search tool surfaced earlier in this process.</w:t>
             </w:r>
           </w:p>
         </w:tc>
@@ -353,7 +353,7 @@
               <w:rPr>
                 <w:sz w:val="20"/>
               </w:rPr>
-              <w:t>Not yet — routing to Neo for approval before Phileke/Stephanie are looped in</w:t>
+              <w:t>Not yet: routing to Neo for approval before Phileke/Stephanie are looped in</w:t>
             </w:r>
           </w:p>
         </w:tc>
@@ -362,12 +362,12 @@
     <w:p/>
     <w:p>
       <w:r>
-        <w:t>VERIFY BEFORE SUBMITTING: this proposes a field trip to Arena Stage that GOODProjects has not yet scheduled. This draft is going to Neo first for go/no-go approval on the concept, date, and budget below — Stephanie Page-Baxter (Director of Youth Programming) and Phileke Holland (Afterschool Lead) should only be looped in to confirm operational logistics after Neo signs off.</w:t>
+        <w:t>VERIFY BEFORE SUBMITTING: this proposes a field trip to Arena Stage that GOODProjects has not yet scheduled. This draft is going to Neo first for go/no-go approval on the concept, date, and budget below. Stephanie Page-Baxter (Director of Youth Programming) and Phileke Holland (Afterschool Lead) should only be looped in to confirm operational logistics after Neo signs off.</w:t>
       </w:r>
     </w:p>
     <w:p>
       <w:r>
-        <w:t>CORRECTED: the $4/ticket rate originally assumed here was Arena Stage's D.C. Ticket Partnership rate. That program is confirmed restricted to D.C. public/charter schools applying directly — it is not open to nonprofit afterschool programs like GOODLearningHub, and the FY27 application cycle is not yet open (last cycle's deadline was Sept 24, 2025, after this grant's deadline anyway). The budget below now uses Arena Stage's standard Group Sales rate instead. Title I status of partner schools is no longer relevant to this budget for that reason.</w:t>
+        <w:t>CORRECTED: the $4/ticket rate originally assumed here was Arena Stage's D.C. Ticket Partnership rate. That program is confirmed restricted to D.C. public/charter schools applying directly; it is not open to nonprofit afterschool programs like GOODLearningHub, and the FY27 application cycle is not yet open (last cycle's deadline was Sept 24, 2025, after this grant's deadline anyway). The budget below now uses Arena Stage's standard Group Sales rate instead. Title I status of partner schools is no longer relevant to this budget for that reason.</w:t>
       </w:r>
     </w:p>
     <w:p>
@@ -388,7 +388,7 @@
         <w:pStyle w:val="ListNumber"/>
       </w:pPr>
       <w:r>
-        <w:t>501(c)(3) status, IRS letter dated at least 1 year before deadline — [x] on file, GOODProjects has held this well over a year</w:t>
+        <w:t>501(c)(3) status, IRS letter dated at least 1 year before deadline: [x] on file, GOODProjects has held this well over a year</w:t>
       </w:r>
     </w:p>
     <w:p>
@@ -396,7 +396,7 @@
         <w:pStyle w:val="ListNumber"/>
       </w:pPr>
       <w:r>
-        <w:t>Registered/authorized to do business in DC — [ ] needs confirming this is current</w:t>
+        <w:t>Registered/authorized to do business in DC: [ ] needs confirming this is current</w:t>
       </w:r>
     </w:p>
     <w:p>
@@ -404,7 +404,7 @@
         <w:pStyle w:val="ListNumber"/>
       </w:pPr>
       <w:r>
-        <w:t>Planning and implementation fully carried out in DC — [x] Arena Stage is in Southwest DC</w:t>
+        <w:t>Planning and implementation fully carried out in DC: [x] Arena Stage is in Southwest DC</w:t>
       </w:r>
     </w:p>
     <w:p>
@@ -412,7 +412,7 @@
         <w:pStyle w:val="ListNumber"/>
       </w:pPr>
       <w:r>
-        <w:t>Active Board of Directors — [x] available</w:t>
+        <w:t>Active Board of Directors: [x] available</w:t>
       </w:r>
     </w:p>
     <w:p>
@@ -420,7 +420,7 @@
         <w:pStyle w:val="ListNumber"/>
       </w:pPr>
       <w:r>
-        <w:t xml:space="preserve">Registered with DLCP, OCFO, DOES, and IRS — [ ] </w:t>
+        <w:t xml:space="preserve">Registered with DLCP, OCFO, DOES, and IRS: [ ] </w:t>
       </w:r>
       <w:r>
         <w:rPr>
@@ -429,7 +429,7 @@
         <w:t>FLAG: this is likely tied to the missing Business License.</w:t>
       </w:r>
       <w:r>
-        <w:t xml:space="preserve"> The Business License gap noted in the attachments checklist may not just be a missing document — DLCP registration is a baseline eligibility requirement here. Confirm GOODProjects' DLCP/business license status before treating this as a simple paperwork gap; if it's genuinely missing, that's a bigger problem than an attachment checkbox.</w:t>
+        <w:t xml:space="preserve"> The Business License gap noted in the attachments checklist may not just be a missing document; DLCP registration is a baseline eligibility requirement here. Confirm GOODProjects' DLCP/business license status before treating this as a simple paperwork gap; if it's genuinely missing, that's a bigger problem than an attachment checkbox.</w:t>
       </w:r>
     </w:p>
     <w:p>
@@ -437,7 +437,7 @@
         <w:pStyle w:val="ListNumber"/>
       </w:pPr>
       <w:r>
-        <w:t>Current on DC taxes/liabilities, or Clean Hands certified — [ ] on file but likely stale, see attachments checklist</w:t>
+        <w:t>Current on DC taxes/liabilities, or Clean Hands certified: [ ] on file but likely stale, see attachments checklist</w:t>
       </w:r>
     </w:p>
     <w:p>
@@ -445,7 +445,7 @@
         <w:pStyle w:val="ListNumber"/>
       </w:pPr>
       <w:r>
-        <w:t>Good standing with CAH — [x] no known issues</w:t>
+        <w:t>Good standing with CAH: [x] no known issues</w:t>
       </w:r>
     </w:p>
     <w:p>
@@ -453,7 +453,7 @@
         <w:pStyle w:val="ListNumber"/>
       </w:pPr>
       <w:r>
-        <w:t>Principal business office address in DC, not a PO box — [x] 996 Maine Avenue SW, Suite 208, confirmed physical DC address</w:t>
+        <w:t>Principal business office address in DC, not a PO box: [x] 996 Maine Avenue SW, Suite 208, confirmed physical DC address</w:t>
       </w:r>
     </w:p>
     <w:p>
@@ -480,7 +480,7 @@
         <w:pStyle w:val="ListBullet"/>
       </w:pPr>
       <w:r>
-        <w:t>One FTE application per fiscal year — fine, this is our only one.</w:t>
+        <w:t>One FTE application per fiscal year: fine, this is our only one.</w:t>
       </w:r>
     </w:p>
     <w:p>
@@ -488,7 +488,7 @@
         <w:pStyle w:val="ListBullet"/>
       </w:pPr>
       <w:r>
-        <w:t>No match/cost-share required — confirmed, matches our budget.</w:t>
+        <w:t>No match/cost-share required: confirmed, matches our budget.</w:t>
       </w:r>
     </w:p>
     <w:p>
@@ -496,12 +496,12 @@
         <w:pStyle w:val="ListBullet"/>
       </w:pPr>
       <w:r>
-        <w:t>Not ineligible on any of the RFA's exclusion grounds (not a service org, not majority non-DC constituents, not requiring a fiscal agent, not for-profit, etc.) — GOODProjects appears to clear all of these.</w:t>
+        <w:t>Not ineligible on any of the RFA's exclusion grounds (not a service org, not majority non-DC constituents, not requiring a fiscal agent, not for-profit, etc.). GOODProjects appears to clear all of these.</w:t>
       </w:r>
     </w:p>
     <w:p>
       <w:r>
-        <w:t xml:space="preserve">TECHNICAL ASSISTANCE STILL AVAILABLE: CAH offers 30-minute application review appointments, but they must be scheduled at least 7 calendar days before the deadline — meaning the cutoff to request one is </w:t>
+        <w:t xml:space="preserve">TECHNICAL ASSISTANCE STILL AVAILABLE: CAH offers 30-minute application review appointments, but they must be scheduled at least 7 calendar days before the deadline, meaning the cutoff to request one is </w:t>
       </w:r>
       <w:r>
         <w:rPr>
@@ -540,12 +540,12 @@
         <w:t>dance as a discipline</w:t>
       </w:r>
       <w:r>
-        <w:t>: a weekday matinee performance of Step Afrika!'s Magical Musical Holiday Step Show at Arena Stage, a professional dance company performance in Southwest DC. GOODProjects is the producer of the field trip experience itself — the curriculum design, pre-trip workshop, chaperoning, on-site learning components, and post-trip reflection — while Arena Stage/Step Afrika produces the underlying performance, consistent with CAH's own eligibility framing of "arts or humanities presenting or producing organizations" and its explicit funding of field trip ticket costs.</w:t>
+        <w:t>: a weekday matinee performance of Step Afrika!'s Magical Musical Holiday Step Show at Arena Stage, a professional dance company performance in Southwest DC. GOODProjects is the producer of the field trip experience itself: the curriculum design, pre-trip workshop, chaperoning, on-site learning components, and post-trip reflection. Arena Stage/Step Afrika produces the underlying performance, consistent with CAH's own eligibility framing of "arts or humanities presenting or producing organizations" and its explicit funding of field trip ticket costs.</w:t>
       </w:r>
     </w:p>
     <w:p>
       <w:r>
-        <w:t>This experience is framed around stepping as a living Black American cultural and historical tradition rooted in HBCU life, community, and storytelling — not just an outing. Pre- and post-trip workshops connect the performance's themes to identity, community history, and creative voice, giving students a structured arts-education experience rather than a one-off entertainment trip. This directly matches CAH's Field Trip Experiences goal of providing comprehensive arts and humanities field trip experiences that advance student achievement, paired with pre- and post-trip workshops and professional development for staff. This production was chosen specifically for this age group and community: it is Arena Stage's annual family-friendly holiday production, built around the African American tradition of stepping, and runs December 4–23, 2026, inside GOODLearningHub's Fall II session (Nov 30 – Dec 17, 2026).</w:t>
+        <w:t>This experience is framed around stepping as a living Black American cultural and historical tradition rooted in HBCU life, community, and storytelling, not just an outing. Pre- and post-trip workshops connect the performance's themes to identity, community history, and creative voice, giving students a structured arts-education experience rather than a one-off entertainment trip. This directly matches CAH's Field Trip Experiences goal of providing comprehensive arts and humanities field trip experiences that advance student achievement, paired with pre- and post-trip workshops and professional development for staff. This production was chosen specifically for this age group and community: it is Arena Stage's annual family-friendly holiday production, built around the African American tradition of stepping, and runs December 4-23, 2026, inside GOODLearningHub's Fall II session (Nov 30 to Dec 17, 2026).</w:t>
       </w:r>
     </w:p>
     <w:p>
@@ -559,7 +559,7 @@
         <w:t>6th-8th grade band under the Dance discipline</w:t>
       </w:r>
       <w:r>
-        <w:t xml:space="preserve"> (one of three disciplines allowed for that band, alongside Film and Theatre). This band was chosen over K-2 or 3-5 (also Dance-eligible) because the stepping tradition's historical and identity-based content connects most authentically to middle-grade SEL and civics content, and because the RFA's community-impact criteria reward developmentally appropriate, curriculum-connected content over a younger audience. GOODLearningHub's exact 6-8 grade enrollment count within its 73 students still needs to be pulled to confirm 30 participants can be drawn from this band alone — this is a decision for Neo/Stephanie, not yet finalized.</w:t>
+        <w:t xml:space="preserve"> (one of three disciplines allowed for that band, alongside Film and Theatre). This band was chosen over K-2 or 3-5 (also Dance-eligible) because the stepping tradition's historical and identity-based content connects most authentically to middle-grade SEL and civics content, and because the RFA's community-impact criteria reward developmentally appropriate, curriculum-connected content over a younger audience. GOODLearningHub's exact 6-8 grade enrollment count within its 73 students still needs to be pulled to confirm 30 participants can be drawn from this band alone. This is a decision for Neo/Stephanie, not yet finalized.</w:t>
       </w:r>
     </w:p>
     <w:p>
@@ -870,7 +870,7 @@
               <w:rPr>
                 <w:sz w:val="20"/>
               </w:rPr>
-              <w:t>Kindergarten – 2nd Grade</w:t>
+              <w:t>Kindergarten to 2nd Grade</w:t>
             </w:r>
           </w:p>
         </w:tc>
@@ -908,7 +908,7 @@
               <w:rPr>
                 <w:sz w:val="20"/>
               </w:rPr>
-              <w:t>3rd – 5th Grade</w:t>
+              <w:t>3rd to 5th Grade</w:t>
             </w:r>
           </w:p>
         </w:tc>
@@ -946,7 +946,7 @@
               <w:rPr>
                 <w:sz w:val="20"/>
               </w:rPr>
-              <w:t>6th – 8th Grade</w:t>
+              <w:t>6th to 8th Grade</w:t>
             </w:r>
           </w:p>
         </w:tc>
@@ -984,7 +984,7 @@
               <w:rPr>
                 <w:sz w:val="20"/>
               </w:rPr>
-              <w:t>9th – 12th Grade</w:t>
+              <w:t>9th to 12th Grade</w:t>
             </w:r>
           </w:p>
         </w:tc>
@@ -1011,7 +1011,7 @@
     <w:p/>
     <w:p>
       <w:r>
-        <w:t xml:space="preserve">IMPORTANT DISCIPLINE FLAG: Theatre is only an eligible discipline for the 6-8 and 9-12 bands. If this application is filed under "Theatre," it is only eligible for grades 6-8 or 9-12 — not K-2 or 3-5. However, Step Afrika! is officially a dance company (its own materials describe it as an "internationally acclaimed Dance Company"), so this trip can reasonably be classified under </w:t>
+        <w:t xml:space="preserve">IMPORTANT DISCIPLINE FLAG: Theatre is only an eligible discipline for the 6-8 and 9-12 bands. If this application is filed under "Theatre," it is only eligible for grades 6-8 or 9-12, not K-2 or 3-5. However, Step Afrika! is officially a dance company (its own materials describe it as an "internationally acclaimed Dance Company"), so this trip can reasonably be classified under </w:t>
       </w:r>
       <w:r>
         <w:rPr>
@@ -1020,7 +1020,7 @@
         <w:t>Dance</w:t>
       </w:r>
       <w:r>
-        <w:t xml:space="preserve"> instead of Theatre — which is an eligible discipline for K-2, 3-5, AND 6-8.</w:t>
+        <w:t xml:space="preserve"> instead of Theatre, which is an eligible discipline for K-2, 3-5, AND 6-8.</w:t>
       </w:r>
     </w:p>
     <w:p>
@@ -1034,7 +1034,7 @@
         <w:t>Dance, 6th-8th grade</w:t>
       </w:r>
       <w:r>
-        <w:t>. GOODLearningHub's exact grade breakdown (not just ages) within its 73 enrolled students still needs to be pulled to confirm 30 participants can be drawn from that single band — this is a decision for Neo/Stephanie, not yet finalized. Our current 30-youth, ages-5-14 framing must be narrowed before submission or the application risks disqualification for not targeting a single grade grouping.</w:t>
+        <w:t>. GOODLearningHub's exact grade breakdown (not just ages) within its 73 enrolled students still needs to be pulled to confirm 30 participants can be drawn from that single band. This is a decision for Neo/Stephanie, not yet finalized. Our current 30-youth, ages-5-14 framing must be narrowed before submission or the application risks disqualification for not targeting a single grade grouping.</w:t>
       </w:r>
     </w:p>
     <w:p>
@@ -1048,7 +1048,7 @@
         <w:t>presenting or producing</w:t>
       </w:r>
       <w:r>
-        <w:t xml:space="preserve"> organizations," and the same section funds "the cost of field trip tickets" — which only makes sense if the intended model is an organization taking students to see a professional production it did not itself create. Read in full context, GOODProjects is the producer of the *field trip experience* (workshops, logistics, curriculum connections, chaperoning, reflection); Arena Stage/Step Afrika produces the underlying performance. This should be stated explicitly in the narrative rather than left ambiguous, since a reviewer could make the same overly literal read Abacus did.</w:t>
+        <w:t xml:space="preserve"> organizations," and the same section funds "the cost of field trip tickets", which only makes sense if the intended model is an organization taking students to see a professional production it did not itself create. Read in full context, GOODProjects is the producer of the *field trip experience* (workshops, logistics, curriculum connections, chaperoning, reflection); Arena Stage/Step Afrika produces the underlying performance. This should be stated explicitly in the narrative rather than left ambiguous, since a reviewer could make the same overly literal read Abacus did.</w:t>
       </w:r>
     </w:p>
     <w:p>
@@ -1132,7 +1132,7 @@
               <w:rPr>
                 <w:sz w:val="20"/>
               </w:rPr>
-              <w:t>Book weekday matinee of Step Afrika!'s Magical Musical Holiday Step Show through Arena Stage Group Sales (not the D.C. Ticket Partnership — see budget note)</w:t>
+              <w:t>Book weekday matinee of Step Afrika!'s Magical Musical Holiday Step Show through Arena Stage Group Sales (not the D.C. Ticket Partnership; see budget note)</w:t>
             </w:r>
           </w:p>
         </w:tc>
@@ -1349,7 +1349,7 @@
     <w:p/>
     <w:p>
       <w:r>
-        <w:t>CORRECTED: the original deliverable list included a "post-show talkback with Arena Stage teaching artists," which is a benefit exclusive to the D.C. Ticket Partnership program (confirmed not open to GOODLearningHub — see below). It has been replaced with Arena Stage's "Interactive" add-on package, which is actually purchasable through standard Group Sales and includes a workshop or backstage tour with teaching artists, a pre-show program, and printed Learning Guides.</w:t>
+        <w:t>CORRECTED: the original deliverable list included a "post-show talkback with Arena Stage teaching artists," which is a benefit exclusive to the D.C. Ticket Partnership program (confirmed not open to GOODLearningHub; see below). It has been replaced with Arena Stage's "Interactive" add-on package, which is actually purchasable through standard Group Sales and includes a workshop or backstage tour with teaching artists, a pre-show program, and printed Learning Guides.</w:t>
       </w:r>
     </w:p>
     <w:p>
@@ -1899,7 +1899,7 @@
               <w:rPr>
                 <w:sz w:val="20"/>
               </w:rPr>
-              <w:t>Final Report only, due Friday, October 15, 2027 — confirmed from RFA; Interim Report only required for awards over $12,500, which does not apply to our $5,500 ask</w:t>
+              <w:t>Final Report only, due Friday, October 15, 2027: confirmed from RFA; Interim Report only required for awards over $12,500, which does not apply to our $5,500 ask</w:t>
             </w:r>
           </w:p>
         </w:tc>
@@ -1924,10 +1924,10 @@
         <w:rPr>
           <w:b/>
         </w:rPr>
-        <w:t>Arts, Humanities, and Arts Education Merit — 40 points (the largest category).</w:t>
+        <w:t>Arts, Humanities, and Arts Education Merit: 40 points (the largest category).</w:t>
       </w:r>
       <w:r>
-        <w:t xml:space="preserve"> CAH's own guidance says panelists review only what is physically in the application — reliance on hyperlinks or "the website has more info" will not help, since panelists are not expected to click through to outside content. Everything below needs to be uploaded as an actual document, not linked:</w:t>
+        <w:t xml:space="preserve"> CAH's own guidance says panelists review only what is physically in the application. Reliance on hyperlinks or "the website has more info" will not help, since panelists are not expected to click through to outside content. Everything below needs to be uploaded as an actual document, not linked:</w:t>
       </w:r>
     </w:p>
     <w:p>
@@ -1983,7 +1983,7 @@
         <w:rPr>
           <w:b/>
         </w:rPr>
-        <w:t>Capacity &amp; Sustainability — 20 points.</w:t>
+        <w:t>Capacity &amp; Sustainability: 20 points.</w:t>
       </w:r>
       <w:r>
         <w:t xml:space="preserve"> GOODProjects' existing strengths apply directly here: a real DC office, an active board, grant management and audit experience from public funding, established program infrastructure. Include an org chart, current budget, financial statements, and staffing roles specific to this project.</w:t>
@@ -1994,7 +1994,7 @@
         <w:rPr>
           <w:b/>
         </w:rPr>
-        <w:t>Community Access &amp; Engagement — 20 points.</w:t>
+        <w:t>Community Access &amp; Engagement: 20 points.</w:t>
       </w:r>
       <w:r>
         <w:t xml:space="preserve"> Be explicit, not implicit, about: no-cost participation for all 30 families, transportation provided (not an out-of-pocket ask), ADA accessibility at Arena Stage, language access if needed for families, and culturally responsive content (the stepping tradition itself is part of this story, not incidental to it).</w:t>
@@ -2005,7 +2005,7 @@
         <w:rPr>
           <w:b/>
         </w:rPr>
-        <w:t>Community Impact — 20 points.</w:t>
+        <w:t>Community Impact: 20 points.</w:t>
       </w:r>
       <w:r>
         <w:t xml:space="preserve"> State plainly: exact number of students and staff served, the evaluation method already in the metrics table above, and that teaching artists/facilitators involved are DC-based (Arena Stage is a DC institution; GOODLearningHub staff are DC-based), which speaks directly to the RFA's "DC-based hiring" scoring point.</w:t>
@@ -2019,7 +2019,7 @@
         <w:t>What to avoid:</w:t>
       </w:r>
       <w:r>
-        <w:t xml:space="preserve"> this narrative should read as an arts/humanities education proposal with a field trip at its center — not a youth-services or violence-prevention proposal with "arts" added on. GOODProjects' broader mission (violence prevention, family stabilization, workforce development, food security) should not be foregrounded in this application; it is real and valuable work, but it is not what this specific grant funds or scores.</w:t>
+        <w:t xml:space="preserve"> this narrative should read as an arts/humanities education proposal with a field trip at its center, not a youth-services or violence-prevention proposal with "arts" added on. GOODProjects' broader mission (violence prevention, family stabilization, workforce development, food security) should not be foregrounded in this application; it is real and valuable work, but it is not what this specific grant funds or scores.</w:t>
       </w:r>
     </w:p>
     <w:p>
@@ -2205,7 +2205,7 @@
               <w:rPr>
                 <w:sz w:val="20"/>
               </w:rPr>
-              <w:t>—</w:t>
+              <w:t>n/a</w:t>
             </w:r>
           </w:p>
         </w:tc>
@@ -2243,7 +2243,7 @@
               <w:rPr>
                 <w:sz w:val="20"/>
               </w:rPr>
-              <w:t>$15/student x 30 students — workshop/backstage tour, pre-show program, printed Learning Guides</w:t>
+              <w:t>$15/student x 30 students: workshop/backstage tour, pre-show program, printed Learning Guides</w:t>
             </w:r>
           </w:p>
         </w:tc>
@@ -2279,7 +2279,7 @@
               <w:rPr>
                 <w:sz w:val="20"/>
               </w:rPr>
-              <w:t>—</w:t>
+              <w:t>n/a</w:t>
             </w:r>
           </w:p>
         </w:tc>
@@ -2353,7 +2353,7 @@
               <w:rPr>
                 <w:sz w:val="20"/>
               </w:rPr>
-              <w:t>—</w:t>
+              <w:t>n/a</w:t>
             </w:r>
           </w:p>
         </w:tc>
@@ -2427,7 +2427,7 @@
               <w:rPr>
                 <w:sz w:val="20"/>
               </w:rPr>
-              <w:t>—</w:t>
+              <w:t>n/a</w:t>
             </w:r>
           </w:p>
         </w:tc>
@@ -2501,7 +2501,7 @@
               <w:rPr>
                 <w:sz w:val="20"/>
               </w:rPr>
-              <w:t>—</w:t>
+              <w:t>n/a</w:t>
             </w:r>
           </w:p>
         </w:tc>
@@ -2569,7 +2569,7 @@
               <w:rPr>
                 <w:sz w:val="20"/>
               </w:rPr>
-              <w:t>—</w:t>
+              <w:t>n/a</w:t>
             </w:r>
           </w:p>
         </w:tc>
@@ -2637,7 +2637,7 @@
               <w:rPr>
                 <w:sz w:val="20"/>
               </w:rPr>
-              <w:t>—</w:t>
+              <w:t>n/a</w:t>
             </w:r>
           </w:p>
         </w:tc>
@@ -2646,7 +2646,7 @@
     <w:p/>
     <w:p>
       <w:r>
-        <w:t>CORRECTED: the ticket line previously assumed the $4/ticket D.C. Ticket Partnership rate. That program is confirmed restricted to D.C. public/charter schools applying directly, is not open to nonprofit afterschool programs, and its FY27 application window is not yet open. The $30/ticket figure above is a mid-range estimate (list price $49, with Arena Stage advertising group discounts of up to 40-50%) — get a formal written quote from Arena Stage Group Sales (202-488-4380 / groups@arenastage.org) before finalizing this figure. Confirmed cap: the live FY27 FTE program page (dcarts.dc.gov/grants/field-trip-experiences) lists the maximum organization award as up to $30,000 — this $5,500 ask has significant headroom under that cap and is not constrained by it.</w:t>
+        <w:t>CORRECTED: the ticket line previously assumed the $4/ticket D.C. Ticket Partnership rate. That program is confirmed restricted to D.C. public/charter schools applying directly, is not open to nonprofit afterschool programs, and its FY27 application window is not yet open. The $30/ticket figure above is a mid-range estimate (list price $49, with Arena Stage advertising group discounts of up to 40-50%). Get a formal written quote from Arena Stage Group Sales (202-488-4380 / groups@arenastage.org) before finalizing this figure. Confirmed cap: the live FY27 FTE program page (dcarts.dc.gov/grants/field-trip-experiences) lists the maximum organization award as up to $30,000. This $5,500 ask has significant headroom under that cap and is not constrained by it.</w:t>
       </w:r>
     </w:p>
     <w:p>
@@ -2675,7 +2675,7 @@
         <w:pStyle w:val="ListBullet"/>
       </w:pPr>
       <w:r>
-        <w:t>Unallowable costs include food/beverages, tuition, fundraiser costs, debt reduction, and operational reserve — none of these appear in our budget. Confirmed clean.</w:t>
+        <w:t>Unallowable costs include food/beverages, tuition, fundraiser costs, debt reduction, and operational reserve. None of these appear in our budget. Confirmed clean.</w:t>
       </w:r>
     </w:p>
     <w:p>
@@ -2683,7 +2683,7 @@
         <w:pStyle w:val="ListBullet"/>
       </w:pPr>
       <w:r>
-        <w:t>Interim Report threshold is $12,500 — our $5,500 ask stays under it, so only a Final Report is required (due Friday, October 15, 2027), consistent with what the draft already assumed.</w:t>
+        <w:t>Interim Report threshold is $12,500: our $5,500 ask stays under it, so only a Final Report is required (due Friday, October 15, 2027), consistent with what the draft already assumed.</w:t>
       </w:r>
     </w:p>
     <w:p>
@@ -2696,7 +2696,7 @@
     </w:p>
     <w:p>
       <w:r>
-        <w:t>REBUILT from the actual FY27 FTE RFA (Section IV.E), which lists 14 mandatory documents — this is a substantially longer list than the prior draft tracked, and several items need real lead time (Board approval, an insurance certificate) that should start now given the July 24 deadline.</w:t>
+        <w:t>REBUILT from the actual FY27 FTE RFA (Section IV.E), which lists 14 mandatory documents. This is a substantially longer list than the prior draft tracked, and several items need real lead time (Board approval, an insurance certificate) that should start now given the July 24 deadline.</w:t>
       </w:r>
     </w:p>
     <w:p>
@@ -2704,7 +2704,7 @@
         <w:pStyle w:val="ListBullet"/>
       </w:pPr>
       <w:r>
-        <w:t>[ ] 1. Work Samples — video/audio of the field trip or a comparable experience, no more than 3 years old. NOT YET COMPILED. This is the highest-weighted content item in scoring (feeds directly into the 40-point Arts/Humanities/Arts Education Merit criterion) — needs real attention, not just a placeholder.</w:t>
+        <w:t>[ ] 1. Work Samples: video/audio of the field trip or a comparable experience, no more than 3 years old. NOT YET COMPILED. This is the highest-weighted content item in scoring (feeds directly into the 40-point Arts/Humanities/Arts Education Merit criterion). It needs real attention, not just a placeholder.</w:t>
       </w:r>
     </w:p>
     <w:p>
@@ -2712,7 +2712,7 @@
         <w:pStyle w:val="ListBullet"/>
       </w:pPr>
       <w:r>
-        <w:t>[ ] 2. Support Materials — up to 3 items (letters of support, syllabi, lesson plans, etc.). NOT YET COMPILED. A letter of support from a partner school (Amidon-Bowen or Jefferson MS) would also help satisfy the RFA's goal of "authentic connections... in collaboration with appropriate personnel at DCPS/DCPCS," which our narrative doesn't currently address.</w:t>
+        <w:t>[ ] 2. Support Materials: up to 3 items (letters of support, syllabi, lesson plans, etc.). NOT YET COMPILED. A letter of support from a partner school (Amidon-Bowen or Jefferson MS) would also help satisfy the RFA's goal of "authentic connections... in collaboration with appropriate personnel at DCPS/DCPCS," which our narrative doesn't currently address.</w:t>
       </w:r>
     </w:p>
     <w:p>
@@ -2720,7 +2720,7 @@
         <w:pStyle w:val="ListBullet"/>
       </w:pPr>
       <w:r>
-        <w:t>[ ] 3. Résumés of Key Personnel — must include role, area of responsibility, AND ward or state of residence. NOT YET COMPILED for Phileke Holland, Stephanie Page-Baxter, or other staff involved.</w:t>
+        <w:t>[ ] 3. Résumés of Key Personnel: must include role, area of responsibility, AND ward or state of residence. NOT YET COMPILED for Phileke Holland, Stephanie Page-Baxter, or other staff involved.</w:t>
       </w:r>
     </w:p>
     <w:p>
@@ -2728,7 +2728,7 @@
         <w:pStyle w:val="ListBullet"/>
       </w:pPr>
       <w:r>
-        <w:t>[ ] 4. Budget Form — CAH's own detailed budget form/template, not just our internal budget table above. NOT YET SOURCED from the grants portal.</w:t>
+        <w:t>[ ] 4. Budget Form: CAH's own detailed budget form/template, not just our internal budget table above. NOT YET SOURCED from the grants portal.</w:t>
       </w:r>
     </w:p>
     <w:p>
@@ -2736,7 +2736,7 @@
         <w:pStyle w:val="ListBullet"/>
       </w:pPr>
       <w:r>
-        <w:t>[x] 5. Certificate of Clean Hands — on file, but ISSUED 4/23/2026. The RFA requires this be issued within 30 days of the application deadline (i.e., after ~June 24, 2026). The one on file is roughly 3 months old and will almost certainly need to be REISSUED before submission.</w:t>
+        <w:t>[x] 5. Certificate of Clean Hands: on file, but ISSUED 4/23/2026. The RFA requires this be issued within 30 days of the application deadline (i.e., after ~June 24, 2026). The one on file is roughly 3 months old and will almost certainly need to be REISSUED before submission.</w:t>
       </w:r>
     </w:p>
     <w:p>
@@ -2744,7 +2744,7 @@
         <w:pStyle w:val="ListBullet"/>
       </w:pPr>
       <w:r>
-        <w:t>[ ] 6. Statement of Certification — date must match the FTE application submission date. NOT YET DONE (can't be done until submission date is set).</w:t>
+        <w:t>[ ] 6. Statement of Certification: date must match the FTE application submission date. NOT YET DONE (can't be done until submission date is set).</w:t>
       </w:r>
     </w:p>
     <w:p>
@@ -2752,7 +2752,7 @@
         <w:pStyle w:val="ListBullet"/>
       </w:pPr>
       <w:r>
-        <w:t>[ ] 7. Signed IRS Form W-9 — must be the March 2024 version, dated to match the submission date, and the address must match both the grants portal and DC's Integrated Financial System (DIFS). NOT YET CONFIRMED current.</w:t>
+        <w:t>[ ] 7. Signed IRS Form W-9: must be the March 2024 version, dated to match the submission date, and the address must match both the grants portal and DC's Integrated Financial System (DIFS). NOT YET CONFIRMED current.</w:t>
       </w:r>
     </w:p>
     <w:p>
@@ -2760,7 +2760,7 @@
         <w:pStyle w:val="ListBullet"/>
       </w:pPr>
       <w:r>
-        <w:t>[ ] 8. Certificate of Liability Insurance (general coverage, with a written waiver of subrogation). STATUS UNKNOWN — need to check with Cole Bradshaw (Finance &amp; Operations) whether GOODProjects has this on file; this can take time to obtain if not.</w:t>
+        <w:t>[ ] 8. Certificate of Liability Insurance (general coverage, with a written waiver of subrogation). STATUS UNKNOWN. Need to check with Cole Bradshaw (Finance &amp; Operations) whether GOODProjects has this on file; this can take time to obtain if not.</w:t>
       </w:r>
     </w:p>
     <w:p>
@@ -2768,7 +2768,7 @@
         <w:pStyle w:val="ListBullet"/>
       </w:pPr>
       <w:r>
-        <w:t>[ ] 9. Balance Sheet — from the most recently completed fiscal year. NOT YET SOURCED.</w:t>
+        <w:t>[ ] 9. Balance Sheet: from the most recently completed fiscal year. NOT YET SOURCED.</w:t>
       </w:r>
     </w:p>
     <w:p>
@@ -2776,7 +2776,7 @@
         <w:pStyle w:val="ListBullet"/>
       </w:pPr>
       <w:r>
-        <w:t>[ ] 10. Current Organizational Budget — must be approved by the Board of Directors. NOT YET SOURCED — confirm this exists and is Board-approved, not just staff-drafted.</w:t>
+        <w:t>[ ] 10. Current Organizational Budget: must be approved by the Board of Directors. NOT YET SOURCED. Confirm this exists and is Board-approved, not just staff-drafted.</w:t>
       </w:r>
     </w:p>
     <w:p>
@@ -2784,7 +2784,7 @@
         <w:pStyle w:val="ListBullet"/>
       </w:pPr>
       <w:r>
-        <w:t>[x] 11. IRS 501(c)(3) Determination Letter — on file.</w:t>
+        <w:t>[x] 11. IRS 501(c)(3) Determination Letter: on file.</w:t>
       </w:r>
     </w:p>
     <w:p>
@@ -2792,7 +2792,7 @@
         <w:pStyle w:val="ListBullet"/>
       </w:pPr>
       <w:r>
-        <w:t>[ ] 12. IRS Form 990 — most recently filed. NOT YET SOURCED.</w:t>
+        <w:t>[ ] 12. IRS Form 990: most recently filed. NOT YET SOURCED.</w:t>
       </w:r>
     </w:p>
     <w:p>
@@ -2800,7 +2800,7 @@
         <w:pStyle w:val="ListBullet"/>
       </w:pPr>
       <w:r>
-        <w:t>[ ] 13. List of current Board of Directors — RFA requires roles (president, treasurer, etc.), responsibilities, AND home addresses/wards, not just a general affiliations list. Our existing "Board of Directors list with affiliations" likely needs augmenting with ward/address data.</w:t>
+        <w:t>[ ] 13. List of current Board of Directors: RFA requires roles (president, treasurer, etc.), responsibilities, AND home addresses/wards, not just a general affiliations list. Our existing "Board of Directors list with affiliations" likely needs augmenting with ward/address data.</w:t>
       </w:r>
     </w:p>
     <w:p>
@@ -2808,12 +2808,12 @@
         <w:pStyle w:val="ListBullet"/>
       </w:pPr>
       <w:r>
-        <w:t>[ ] 14. Profit and Loss Statement — from the most recently completed fiscal quarter. NOT YET SOURCED.</w:t>
+        <w:t>[ ] 14. Profit and Loss Statement: from the most recently completed fiscal quarter. NOT YET SOURCED.</w:t>
       </w:r>
     </w:p>
     <w:p>
       <w:r>
-        <w:t>ADDITIONAL REQUIREMENT (Section III.B): a sworn, written statement disclosing whether the applicant has been indicted or convicted of financial misconduct or fraud in the last 3 years. NOT YET DRAFTED — this is a required disclosure, not optional.</w:t>
+        <w:t>ADDITIONAL REQUIREMENT (Section III.B): a sworn, written statement disclosing whether the applicant has been indicted or convicted of financial misconduct or fraud in the last 3 years. NOT YET DRAFTED. This is a required disclosure, not optional.</w:t>
       </w:r>
     </w:p>
     <w:p>
@@ -2837,7 +2837,7 @@
         <w:pStyle w:val="ListBullet"/>
       </w:pPr>
       <w:r>
-        <w:t>02 [x] Funder ask is within the stated cap — live FY27 FTE program page confirms up to $30,000 maximum organization award; our $5,500 ask has significant headroom</w:t>
+        <w:t>02 [x] Funder ask is within the stated cap: live FY27 FTE program page confirms up to $30,000 maximum organization award; our $5,500 ask has significant headroom</w:t>
       </w:r>
     </w:p>
     <w:p>
@@ -2853,7 +2853,7 @@
         <w:pStyle w:val="ListBullet"/>
       </w:pPr>
       <w:r>
-        <w:t>04 [ ] Field trip logistics not yet confirmed with Stephanie Page-Baxter or Phileke Holland — routing to Neo for concept/budget approval first, then to them for logistics confirmation</w:t>
+        <w:t>04 [ ] Field trip logistics not yet confirmed with Stephanie Page-Baxter or Phileke Holland, routing to Neo for concept/budget approval first, then to them for logistics confirmation</w:t>
       </w:r>
     </w:p>
     <w:p>
@@ -2861,7 +2861,7 @@
         <w:pStyle w:val="ListBullet"/>
       </w:pPr>
       <w:r>
-        <w:t>04a [ ] Grade-grouping requirement RESOLVED as a rule (must pick ONE band, recommend classifying under Dance) but the actual band + matching enrollment numbers still need Neo's decision — see Target Population note</w:t>
+        <w:t>04a [ ] Grade-grouping requirement RESOLVED as a rule (must pick ONE band, recommend classifying under Dance) but the actual band + matching enrollment numbers still need Neo's decision, see Target Population note</w:t>
       </w:r>
     </w:p>
     <w:p>
@@ -2869,7 +2869,7 @@
         <w:pStyle w:val="ListBullet"/>
       </w:pPr>
       <w:r>
-        <w:t>04b [ ] Exact 2026/27 matinee date/time not yet confirmed with Arena Stage Group Sales — proposed Dec 10, 2026 is a projection, not a booking</w:t>
+        <w:t>04b [ ] Exact 2026/27 matinee date/time not yet confirmed with Arena Stage Group Sales, proposed Dec 10, 2026 is a projection, not a booking</w:t>
       </w:r>
     </w:p>
     <w:p>
@@ -2877,7 +2877,7 @@
         <w:pStyle w:val="ListBullet"/>
       </w:pPr>
       <w:r>
-        <w:t>04c [ ] Formal Group Sales ticket quote not yet obtained — $30/ticket is an estimate, not a confirmed rate</w:t>
+        <w:t>04c [ ] Formal Group Sales ticket quote not yet obtained: $30/ticket is an estimate, not a confirmed rate</w:t>
       </w:r>
     </w:p>
     <w:p>
@@ -2885,7 +2885,7 @@
         <w:pStyle w:val="ListBullet"/>
       </w:pPr>
       <w:r>
-        <w:t>04d [ ] Business License / DLCP registration status unknown — confirm this isn't a baseline eligibility blocker, not just a missing attachment</w:t>
+        <w:t>04d [ ] Business License / DLCP registration status unknown: confirm this isn't a baseline eligibility blocker, not just a missing attachment</w:t>
       </w:r>
     </w:p>
     <w:p>
@@ -2893,7 +2893,7 @@
         <w:pStyle w:val="ListBullet"/>
       </w:pPr>
       <w:r>
-        <w:t>04e [ ] GOS overlap check needed — has GOODProjects applied for FY27 CAH General Operating Support? If so, this FTE application must represent new/additional programming</w:t>
+        <w:t>04e [ ] GOS overlap check needed: has GOODProjects applied for FY27 CAH General Operating Support? If so, this FTE application must represent new/additional programming</w:t>
       </w:r>
     </w:p>
     <w:p>
@@ -2901,7 +2901,7 @@
         <w:pStyle w:val="ListBullet"/>
       </w:pPr>
       <w:r>
-        <w:t>04f [ ] Clean Hands Certificate on file is dated 4/23/2026 — RFA requires issuance within 30 days of the July 24 deadline; will need reissuing</w:t>
+        <w:t>04f [ ] Clean Hands Certificate on file is dated 4/23/2026: RFA requires issuance within 30 days of the July 24 deadline; will need reissuing</w:t>
       </w:r>
     </w:p>
     <w:p>
@@ -2909,7 +2909,7 @@
         <w:pStyle w:val="ListBullet"/>
       </w:pPr>
       <w:r>
-        <w:t>04g [ ] 9 of the 14 required RFA attachments are not yet compiled (Work Samples, Support Materials, Résumés with ward info, CAH Budget Form, Statement of Certification, current W-9, Liability Insurance Certificate, Balance Sheet, Board-approved Org Budget, Form 990, P&amp;L Statement) — see full attachments checklist. This is a substantially larger lift than previously tracked; some items (insurance certificate, Board-approved budget) need real lead time before July 24.</w:t>
+        <w:t>04g [ ] 9 of the 14 required RFA attachments are not yet compiled (Work Samples, Support Materials, Résumés with ward info, CAH Budget Form, Statement of Certification, current W-9, Liability Insurance Certificate, Balance Sheet, Board-approved Org Budget, Form 990, P&amp;L Statement), see full attachments checklist. This is a substantially larger lift than previously tracked; some items (insurance certificate, Board-approved budget) need real lead time before July 24.</w:t>
       </w:r>
     </w:p>
     <w:p>
@@ -2917,7 +2917,7 @@
         <w:pStyle w:val="ListBullet"/>
       </w:pPr>
       <w:r>
-        <w:t>04h [ ] Financial misconduct/fraud disclosure statement not yet drafted — required, not optional</w:t>
+        <w:t>04h [ ] Financial misconduct/fraud disclosure statement not yet drafted: required, not optional</w:t>
       </w:r>
     </w:p>
     <w:p>
@@ -2973,7 +2973,7 @@
         <w:pStyle w:val="ListBullet"/>
       </w:pPr>
       <w:r>
-        <w:t>11 [ ] Attachments not yet assembled — see expanded 14-item checklist above</w:t>
+        <w:t>11 [ ] Attachments not yet assembled: see expanded 14-item checklist above</w:t>
       </w:r>
     </w:p>
     <w:p>
@@ -3005,7 +3005,7 @@
         <w:pStyle w:val="ListBullet"/>
       </w:pPr>
       <w:r>
-        <w:t>15 [ ] Technical assistance appointment with CAH (Andrea Brown) not yet booked — window closes Friday, July 17, 2026, given the volume of open items above</w:t>
+        <w:t>15 [ ] Technical assistance appointment with CAH (Andrea Brown) not yet booked: window closes Friday, July 17, 2026, given the volume of open items above</w:t>
       </w:r>
     </w:p>
     <w:p>
@@ -3013,7 +3013,7 @@
         <w:pStyle w:val="ListBullet"/>
       </w:pPr>
       <w:r>
-        <w:t>16 [x] "Producer of the field trip experience" requirement addressed explicitly in the narrative (Program Purpose section), rather than left ambiguous — resolves a disqualification concern raised by an internal Abacus review that didn't hold up against the full RFA text</w:t>
+        <w:t>16 [x] "Producer of the field trip experience" requirement addressed explicitly in the narrative (Program Purpose section) rather than left ambiguous. This resolves a disqualification concern raised by an internal Abacus review that didn't hold up against the full RFA text</w:t>
       </w:r>
     </w:p>
     <w:p>
@@ -3021,7 +3021,7 @@
         <w:pStyle w:val="ListBullet"/>
       </w:pPr>
       <w:r>
-        <w:t>17 [ ] All Arts Merit evidence (lesson plans, workshop outline, work samples, facilitator bios) still needs to be gathered and uploaded as actual documents — CAH panelists do not click through to outside links or websites</w:t>
+        <w:t>17 [ ] All Arts Merit evidence (lesson plans, workshop outline, work samples, facilitator bios) still needs to be gathered and uploaded as actual documents. CAH panelists do not click through to outside links or websites</w:t>
       </w:r>
     </w:p>
     <w:p>
@@ -3057,7 +3057,7 @@
         <w:pStyle w:val="Heading1"/>
       </w:pPr>
       <w:r>
-        <w:t>FIELD TRIP CONCEPT — FOR NEO'S APPROVAL</w:t>
+        <w:t>FIELD TRIP CONCEPT: FOR NEO'S APPROVAL</w:t>
       </w:r>
     </w:p>
     <w:p>
@@ -3125,7 +3125,7 @@
         <w:pStyle w:val="ListBullet"/>
       </w:pPr>
       <w:r>
-        <w:t>It is Arena Stage's own production, in DC — satisfies CAH's hard requirement that all FTE</w:t>
+        <w:t>It is Arena Stage's own production, in DC, which satisfies CAH's hard requirement that all FTE</w:t>
       </w:r>
     </w:p>
     <w:p>
@@ -3138,7 +3138,7 @@
         <w:pStyle w:val="ListBullet"/>
       </w:pPr>
       <w:r>
-        <w:t>It is a family-friendly holiday production built around African American stepping — fits our</w:t>
+        <w:t>It is a family-friendly holiday production built around African American stepping that fits our</w:t>
       </w:r>
     </w:p>
     <w:p>
@@ -3151,12 +3151,12 @@
         <w:pStyle w:val="ListBullet"/>
       </w:pPr>
       <w:r>
-        <w:t>It runs December 4–23, 2026, which lands inside GOODLearningHub's existing Fall II session</w:t>
+        <w:t>It runs December 4-23, 2026, which lands inside GOODLearningHub's existing Fall II session</w:t>
       </w:r>
     </w:p>
     <w:p>
       <w:r>
-        <w:t>(Nov 30 – Dec 17, 2026) — no new session or special scheduling required</w:t>
+        <w:t>(Nov 30 to Dec 17, 2026): no new session or special scheduling required</w:t>
       </w:r>
     </w:p>
     <w:p>
@@ -3200,7 +3200,7 @@
     </w:p>
     <w:p>
       <w:r>
-        <w:t>Backup: Thursday, December 17, 2026 — but that's the last day of the Fall II session, so it has</w:t>
+        <w:t>Backup: Thursday, December 17, 2026, but that's the last day of the Fall II session, so it has</w:t>
       </w:r>
     </w:p>
     <w:p>
@@ -3223,7 +3223,7 @@
     </w:p>
     <w:p>
       <w:r>
-        <w:t>30 of GOODLearningHub's 73 enrolled students, ages 5–14, from James Creek, Syphax Gardens, and</w:t>
+        <w:t>30 of GOODLearningHub's 73 enrolled students, ages 5-14, from James Creek, Syphax Gardens, and</w:t>
       </w:r>
     </w:p>
     <w:p>
@@ -3244,7 +3244,7 @@
     </w:p>
     <w:p>
       <w:r>
-        <w:t>exactly ONE grade grouping, each tied to specific disciplines — K-2 (Dance/Music/Visual Arts), 3-5</w:t>
+        <w:t>exactly ONE grade grouping, each tied to specific disciplines: K-2 (Dance/Music/Visual Arts), 3-5</w:t>
       </w:r>
     </w:p>
     <w:p>
@@ -3284,7 +3284,7 @@
     </w:p>
     <w:p>
       <w:r>
-        <w:t>Abacus review against the RFA — Abacus's specific suggestion to reclassify by discipline was</w:t>
+        <w:t>Abacus review against the RFA: Abacus's specific suggestion to reclassify by discipline was</w:t>
       </w:r>
     </w:p>
     <w:p>
@@ -3304,7 +3304,7 @@
     </w:p>
     <w:p>
       <w:r>
-        <w:t>aren't a dance company ourselves — I checked that against the full RFA text and it doesn't hold up:</w:t>
+        <w:t>aren't a dance company ourselves. I checked that against the full RFA text and it doesn't hold up:</w:t>
       </w:r>
     </w:p>
     <w:p>
@@ -3348,7 +3348,7 @@
         <w:t>Ask: $5,500</w:t>
       </w:r>
       <w:r>
-        <w:t xml:space="preserve"> (revised up from an earlier $4,500 draft — see correction below)</w:t>
+        <w:t xml:space="preserve"> (revised up from an earlier $4,500 draft; see correction below)</w:t>
       </w:r>
     </w:p>
     <w:p>
@@ -3450,7 +3450,7 @@
               <w:rPr>
                 <w:sz w:val="20"/>
               </w:rPr>
-              <w:t>Tickets — 37 (30 students + ~7 chaperones/staff) at an estimated $30/ticket group rate</w:t>
+              <w:t>Tickets: 37 (30 students + ~7 chaperones/staff) at an estimated $30/ticket group rate</w:t>
             </w:r>
           </w:p>
         </w:tc>
@@ -3718,7 +3718,7 @@
     </w:p>
     <w:p>
       <w:r>
-        <w:t>Stage's D.C. Ticket Partnership rate. We checked that program directly — it's restricted to D.C.</w:t>
+        <w:t>Stage's D.C. Ticket Partnership rate. We checked that program directly: it's restricted to D.C.</w:t>
       </w:r>
     </w:p>
     <w:p>
@@ -3738,12 +3738,12 @@
     </w:p>
     <w:p>
       <w:r>
-        <w:t>(list price $49/ticket, group discounts advertised up to 40-50% off) — still an estimate pending a</w:t>
+        <w:t>(list price $49/ticket, group discounts advertised up to 40-50% off). This is still an estimate</w:t>
       </w:r>
     </w:p>
     <w:p>
       <w:r>
-        <w:t>formal quote, not a confirmed rate.</w:t>
+        <w:t>pending a formal quote, not a confirmed rate.</w:t>
       </w:r>
     </w:p>
     <w:p>
@@ -3804,7 +3804,7 @@
     </w:p>
     <w:p>
       <w:r>
-        <w:t>**Still open — needs Neo's sign-off on how to proceed, then confirmation from Arena Stage or</w:t>
+        <w:t>**Still open: needs Neo's sign-off on how to proceed, then confirmation from Arena Stage or</w:t>
       </w:r>
     </w:p>
     <w:p>
@@ -3841,7 +3841,7 @@
         <w:pStyle w:val="ListNumber"/>
       </w:pPr>
       <w:r>
-        <w:t>Whether this trip is operationally realistic in the FY27 program year — Phileke and Stephanie's</w:t>
+        <w:t>Whether this trip is operationally realistic in the FY27 program year: Phileke and Stephanie's</w:t>
       </w:r>
     </w:p>
     <w:p>
@@ -3854,7 +3854,7 @@
         <w:pStyle w:val="ListNumber"/>
       </w:pPr>
       <w:r>
-        <w:t>Whether GOODProjects' partner schools carry Title I status — no longer relevant to the budget</w:t>
+        <w:t>Whether GOODProjects' partner schools carry Title I status: no longer relevant to the budget</w:t>
       </w:r>
     </w:p>
     <w:p>
@@ -3867,7 +3867,7 @@
         <w:pStyle w:val="ListNumber"/>
       </w:pPr>
       <w:r>
-        <w:t>Whether GOODProjects' Business License/DLCP registration is actually on file — this showed up</w:t>
+        <w:t>Whether GOODProjects' Business License/DLCP registration is actually on file: this showed up</w:t>
       </w:r>
     </w:p>
     <w:p>
@@ -3885,7 +3885,7 @@
         <w:pStyle w:val="ListNumber"/>
       </w:pPr>
       <w:r>
-        <w:t>Whether GOODProjects applied for CAH's FY27 General Operating Support grant — if so, this</w:t>
+        <w:t>Whether GOODProjects applied for CAH's FY27 General Operating Support grant: if so, this</w:t>
       </w:r>
     </w:p>
     <w:p>
@@ -3903,7 +3903,7 @@
     </w:p>
     <w:p>
       <w:r>
-        <w:t>draft above) — this is a much bigger lift than originally scoped, and a few items (a liability</w:t>
+        <w:t>draft above): this is a much bigger lift than originally scoped, and a few items (a liability</w:t>
       </w:r>
     </w:p>
     <w:p>
@@ -3921,7 +3921,7 @@
     </w:p>
     <w:p>
       <w:r>
-        <w:t>pulled together and uploaded directly — CAH panelists don't click through to outside links, so</w:t>
+        <w:t>pulled together and uploaded directly: CAH panelists don't click through to outside links, so</w:t>
       </w:r>
     </w:p>
     <w:p>
@@ -3941,22 +3941,27 @@
     </w:p>
     <w:p>
       <w:r>
-        <w:t>could not be independently verified anywhere on Arena Stage's own site — not used anywhere in this</w:t>
+        <w:t>could not be independently verified anywhere on Arena Stage's own site; these are not used</w:t>
       </w:r>
     </w:p>
     <w:p>
       <w:r>
-        <w:t>document. (2) A GOODProjects internal Abacus review raised a "producer of the experience" concern</w:t>
+        <w:t>anywhere in this document. (2) A GOODProjects internal Abacus review raised a "producer of the</w:t>
       </w:r>
     </w:p>
     <w:p>
       <w:r>
-        <w:t>that, read against the full RFA text rather than one isolated sentence, does not actually hold up —</w:t>
+        <w:t>experience" concern that, read against the full RFA text rather than one isolated sentence, does</w:t>
       </w:r>
     </w:p>
     <w:p>
       <w:r>
-        <w:t>addressed directly in the narrative rather than silently accepted. Both are a reminder to verify</w:t>
+        <w:t>not actually hold up. It's addressed directly in the narrative rather than silently accepted.</w:t>
+      </w:r>
+    </w:p>
+    <w:p>
+      <w:r>
+        <w:t>Both are a reminder to verify</w:t>
       </w:r>
     </w:p>
     <w:p>

</xml_diff>

<commit_message>
Add action plan for FTE Addendum A work samples and remaining attachments
Dumisani pasted the CAH Addendum A (work samples, support materials,
resume requirements). Built a prioritized, owner-assigned action plan
so these get requested now instead of piling up before the July 24
deadline: real candidate work samples from GOODProjects' own past
events (GOODSports dance, the Christmas Play, Family Arts & Craft
Festival), a letter of support ask to Stephanie for Jefferson Middle
School, resume/ward-of-residence requests for Stephanie and Phileke,
a qualitative-evaluation gap fix, and a compliance-document table
routed to Cole Bradshaw. Also folded the addendum's technical specs
(file format, size, labeling, video/audio rules) into the master
attachments checklist.
</commit_message>
<xml_diff>
--- a/app/drafts/exports/DC Arts and Humanities FTE Grant Draft.docx
+++ b/app/drafts/exports/DC Arts and Humanities FTE Grant Draft.docx
@@ -2704,7 +2704,7 @@
         <w:pStyle w:val="ListBullet"/>
       </w:pPr>
       <w:r>
-        <w:t>[ ] 1. Work Samples: video/audio of the field trip or a comparable experience, no more than 3 years old. NOT YET COMPILED. This is the highest-weighted content item in scoring (feeds directly into the 40-point Arts/Humanities/Arts Education Merit criterion). It needs real attention, not just a placeholder.</w:t>
+        <w:t>[ ] 1. Work Samples: video/audio of the field trip or a comparable experience, no more than 3 years old. NOT YET COMPILED. This is the highest-weighted content item in scoring (feeds directly into the 40-point Arts/Humanities/Arts Education Merit criterion). Per Addendum A: since GOODProjects hasn't run this exact field trip before, the RFA explicitly allows "samples of similar projects completed" instead. Best real candidates: GOODSports dance sessions, the Christmas Play or Family Arts &amp; Craft Festival from the 2026 community calendar, or documented STREAM Arts activities. Technical requirements: photos as JPEG/JPG at 72 dpi minimum, max 8MB each; video must not be highly-edited/promotional, must avoid poor lighting or shaky footage, and must mark a timecode if over 5 minutes; every sample needs a specific name/title label; a website screenshot does not count as an adequate sample. See the full action plan for details.</w:t>
       </w:r>
     </w:p>
     <w:p>
@@ -2712,7 +2712,7 @@
         <w:pStyle w:val="ListBullet"/>
       </w:pPr>
       <w:r>
-        <w:t>[ ] 2. Support Materials: up to 3 items (letters of support, syllabi, lesson plans, etc.). NOT YET COMPILED. A letter of support from a partner school (Amidon-Bowen or Jefferson MS) would also help satisfy the RFA's goal of "authentic connections... in collaboration with appropriate personnel at DCPS/DCPCS," which our narrative doesn't currently address.</w:t>
+        <w:t>[ ] 2. Support Materials: up to 3 items (letters of support, syllabi, lesson plans, etc.). NOT YET COMPILED. A letter of support from a partner school (Amidon-Bowen or Jefferson MS) would also help satisfy the RFA's goal of "authentic connections... in collaboration with appropriate personnel at DCPS/DCPCS," which our narrative doesn't currently address. Request this from Stephanie Page-Baxter this week; school sign-off can take longer than expected.</w:t>
       </w:r>
     </w:p>
     <w:p>
@@ -2720,7 +2720,7 @@
         <w:pStyle w:val="ListBullet"/>
       </w:pPr>
       <w:r>
-        <w:t>[ ] 3. Résumés of Key Personnel: must include role, area of responsibility, AND ward or state of residence. NOT YET COMPILED for Phileke Holland, Stephanie Page-Baxter, or other staff involved.</w:t>
+        <w:t>[ ] 3. Résumés of Key Personnel: must include role, area of responsibility, AND ward or state of residence. NOT YET COMPILED for Phileke Holland, Stephanie Page-Baxter, or other staff involved. Ward/state of residence is not in any existing org document and must be requested directly from each person.</w:t>
       </w:r>
     </w:p>
     <w:p>

</xml_diff>

<commit_message>
Add grant overview and GOODProjects' own statement of need to the top of the draft
Leads the document with a plain-language overview of the CAH FTE
grant and this specific application, followed by the organizational
case for why GOODProjects itself is pursuing it: no existing funded
arts/humanities line in GOODLearningHub, proximity-without-access for
students living near Arena Stage, and the strategic value of a first
CAH arts award distinct from the org's core violence-prevention and
family-stabilization funding base.
</commit_message>
<xml_diff>
--- a/app/drafts/exports/DC Arts and Humanities FTE Grant Draft.docx
+++ b/app/drafts/exports/DC Arts and Humanities FTE Grant Draft.docx
@@ -24,6 +24,162 @@
     <w:p>
       <w:r>
         <w:t>STATUS: Draft for Neo's go/no-go review. Not yet submitted. This proposes a NEW field trip GOODProjects has not yet run. Stephanie Page-Baxter or Phileke Holland should confirm this is deliverable before it goes out.</w:t>
+      </w:r>
+    </w:p>
+    <w:p>
+      <w:pPr>
+        <w:pStyle w:val="Heading2"/>
+      </w:pPr>
+      <w:r>
+        <w:t>OVERVIEW OF THIS GRANT</w:t>
+      </w:r>
+    </w:p>
+    <w:p>
+      <w:r>
+        <w:t>The DC Commission on the Arts and Humanities (CAH) runs an annual Field Trip Experiences (FTE)</w:t>
+      </w:r>
+    </w:p>
+    <w:p>
+      <w:r>
+        <w:t>grant program that funds DC nonprofits to take students to real arts and humanities experiences,</w:t>
+      </w:r>
+    </w:p>
+    <w:p>
+      <w:r>
+        <w:t>covering ticket costs, pre/post-trip workshops, educator professional development, and the staff</w:t>
+      </w:r>
+    </w:p>
+    <w:p>
+      <w:r>
+        <w:t>time to plan and run it. Applicants must target one grade grouping tied to a specific discipline,</w:t>
+      </w:r>
+    </w:p>
+    <w:p>
+      <w:r>
+        <w:t>and all programming must take place inside DC.</w:t>
+      </w:r>
+    </w:p>
+    <w:p>
+      <w:r>
+        <w:t>GOODProjects is requesting $5,500 (well under CAH's $30,000 cap) to take 30 6th-8th grade</w:t>
+      </w:r>
+    </w:p>
+    <w:p>
+      <w:r>
+        <w:t>GOODLearningHub students to a weekday matinee of Step Afrika!'s Magical Musical Holiday Step</w:t>
+      </w:r>
+    </w:p>
+    <w:p>
+      <w:r>
+        <w:t>Show at Arena Stage in Southwest DC this December, paired with a pre-trip workshop, an on-site</w:t>
+      </w:r>
+    </w:p>
+    <w:p>
+      <w:r>
+        <w:t>session with Arena Stage teaching artists, and a post-trip reflection activity. The application</w:t>
+      </w:r>
+    </w:p>
+    <w:p>
+      <w:r>
+        <w:t>is filed under the Dance discipline. The deadline is 5:00 PM ET, Thursday, July 24, 2026.</w:t>
+      </w:r>
+    </w:p>
+    <w:p>
+      <w:pPr>
+        <w:pStyle w:val="Heading2"/>
+      </w:pPr>
+      <w:r>
+        <w:t>THE NEED, FROM GOODPROJECTS' POINT OF VIEW</w:t>
+      </w:r>
+    </w:p>
+    <w:p>
+      <w:r>
+        <w:t>GOODLearningHub already provides 73 enrolled youth with tutoring, Social-Emotional Learning,</w:t>
+      </w:r>
+    </w:p>
+    <w:p>
+      <w:r>
+        <w:t>mental health support, and daily meals, but it has no dedicated funding line for arts and</w:t>
+      </w:r>
+    </w:p>
+    <w:p>
+      <w:r>
+        <w:t>humanities enrichment specifically. GOODSports touches dance as a life-skills vehicle and STREAM</w:t>
+      </w:r>
+    </w:p>
+    <w:p>
+      <w:r>
+        <w:t>touches the arts, but neither is funded or structured as real arts education, and GOODProjects</w:t>
+      </w:r>
+    </w:p>
+    <w:p>
+      <w:r>
+        <w:t>has never run a field trip to a professional DC arts institution.</w:t>
+      </w:r>
+    </w:p>
+    <w:p>
+      <w:r>
+        <w:t>That gap matters for a specific reason: GOODLearningHub's students live minutes from Arena Stage,</w:t>
+      </w:r>
+    </w:p>
+    <w:p>
+      <w:r>
+        <w:t>one of DC's leading professional theaters, but a family below 200% of the federal poverty line in</w:t>
+      </w:r>
+    </w:p>
+    <w:p>
+      <w:r>
+        <w:t>James Creek, Syphax Gardens, or Greenleaf has no realistic path to attending a show there without</w:t>
+      </w:r>
+    </w:p>
+    <w:p>
+      <w:r>
+        <w:t>outside support. Proximity without access is exactly the kind of gap GOODProjects exists to close</w:t>
+      </w:r>
+    </w:p>
+    <w:p>
+      <w:r>
+        <w:t>in every other part of its work (housing, food, safety); this grant lets it close that same kind</w:t>
+      </w:r>
+    </w:p>
+    <w:p>
+      <w:r>
+        <w:t>of gap for arts access specifically.</w:t>
+      </w:r>
+    </w:p>
+    <w:p>
+      <w:r>
+        <w:t>This grant also serves GOODProjects organizationally, not just its students. It is the</w:t>
+      </w:r>
+    </w:p>
+    <w:p>
+      <w:r>
+        <w:t>organization's first CAH award attempt built specifically around arts and humanities programming,</w:t>
+      </w:r>
+    </w:p>
+    <w:p>
+      <w:r>
+        <w:t>distinct from the violence-prevention, family-stabilization, and workforce funding that makes up</w:t>
+      </w:r>
+    </w:p>
+    <w:p>
+      <w:r>
+        <w:t>most of its portfolio. A successful award establishes a track record with CAH, strengthens the</w:t>
+      </w:r>
+    </w:p>
+    <w:p>
+      <w:r>
+        <w:t>existing Jefferson Middle School partnership by grounding it in a real shared activity, and gives</w:t>
+      </w:r>
+    </w:p>
+    <w:p>
+      <w:r>
+        <w:t>Stephanie Page-Baxter and Phileke Holland a funded, structured way to build out the arts</w:t>
+      </w:r>
+    </w:p>
+    <w:p>
+      <w:r>
+        <w:t>component of GOODLearningHub's SEL work rather than leaving it informal and unfunded.</w:t>
       </w:r>
     </w:p>
     <w:p>
@@ -3021,7 +3177,7 @@
         <w:pStyle w:val="ListBullet"/>
       </w:pPr>
       <w:r>
-        <w:t>17 [ ] All Arts Merit evidence (lesson plans, workshop outline, work samples, facilitator bios) still needs to be gathered and uploaded as actual documents. CAH panelists do not click through to outside links or websites</w:t>
+        <w:t>17 [x] Pre-trip lesson plan, post-trip reflection outline, and facilitator bios for Stephanie Page-Baxter and Phileke Holland fully drafted (see 2026-07-dc-arts-humanities-lesson-plans.md). [ ] Photo/video work samples and each facilitator's ward/state of residence still need to be sourced directly from Adam Hickson, Stephanie, and Phileke; a document cannot supply these on its own</w:t>
       </w:r>
     </w:p>
     <w:p>
@@ -3029,7 +3185,31 @@
         <w:pStyle w:val="ListBullet"/>
       </w:pPr>
       <w:r>
-        <w:t>18 [ ] Narrative reviewed to confirm it stays centered on arts/humanities education, not GOODProjects' broader youth-services mission</w:t>
+        <w:t>18 [x] Narrative reviewed and confirmed to stay centered on arts/humanities education, not GOODProjects' broader youth-services mission</w:t>
+      </w:r>
+    </w:p>
+    <w:p>
+      <w:pPr>
+        <w:pStyle w:val="ListBullet"/>
+      </w:pPr>
+      <w:r>
+        <w:t>19 [x] Draft outreach messages prepared for Adam Hickson, Stephanie Page-Baxter, Phileke Holland, Cole Bradshaw, and Arena Stage Group Sales (see 2026-07-dc-arts-humanities-outreach-templates.md), ready to send as-is</w:t>
+      </w:r>
+    </w:p>
+    <w:p>
+      <w:pPr>
+        <w:pStyle w:val="ListBullet"/>
+      </w:pPr>
+      <w:r>
+        <w:t>20 [x] Statement of Certification and financial misconduct disclosure drafted as templates (see 2026-07-dc-arts-humanities-certification-templates.md). [ ] Both still require Darius Baxter's real signature and, for the disclosure, his factual confirmation, which cannot be supplied by drafting alone</w:t>
+      </w:r>
+    </w:p>
+    <w:p>
+      <w:pPr>
+        <w:pStyle w:val="ListBullet"/>
+      </w:pPr>
+      <w:r>
+        <w:t>21 [x] Qualitative evaluation element added to the narrative (post-trip written reflections), closing the Addendum A qualitative/quantitative gap</w:t>
       </w:r>
     </w:p>
     <w:p>

</xml_diff>